<commit_message>
feat:add report approval and indicator assignment workflow
</commit_message>
<xml_diff>
--- a/HospitalQualityDashboard/Tai_Lieu/Phân chia các chỉ số dựa theo đơn vị thu thập và tổng hợp.docx
+++ b/HospitalQualityDashboard/Tai_Lieu/Phân chia các chỉ số dựa theo đơn vị thu thập và tổng hợp.docx
@@ -19,17 +19,7 @@
           <w:sz w:val="28"/>
           <w:szCs w:val="28"/>
         </w:rPr>
-        <w:t>Thu thập và tổng hợp số liệu</w:t>
-      </w:r>
-      <w:r>
-        <w:rPr>
-          <w:rFonts w:ascii="Times New Roman" w:hAnsi="Times New Roman" w:cs="Times New Roman"/>
-          <w:b/>
-          <w:bCs/>
-          <w:sz w:val="28"/>
-          <w:szCs w:val="28"/>
-        </w:rPr>
-        <w:t>:</w:t>
+        <w:t>Thu thập và tổng hợp số liệu:</w:t>
       </w:r>
       <w:r>
         <w:rPr>
@@ -6022,923 +6012,6 @@
           <w:sz w:val="28"/>
           <w:szCs w:val="28"/>
         </w:rPr>
-        <w:t>10.</w:t>
-      </w:r>
-    </w:p>
-    <w:tbl>
-      <w:tblPr>
-        <w:tblStyle w:val="TableGrid"/>
-        <w:tblW w:w="9702" w:type="dxa"/>
-        <w:tblInd w:w="74" w:type="dxa"/>
-        <w:tblLook w:val="04A0" w:firstRow="1" w:lastRow="0" w:firstColumn="1" w:lastColumn="0" w:noHBand="0" w:noVBand="1"/>
-      </w:tblPr>
-      <w:tblGrid>
-        <w:gridCol w:w="1991"/>
-        <w:gridCol w:w="7711"/>
-      </w:tblGrid>
-      <w:tr>
-        <w:tc>
-          <w:tcPr>
-            <w:tcW w:w="1991" w:type="dxa"/>
-          </w:tcPr>
-          <w:p>
-            <w:pPr>
-              <w:tabs>
-                <w:tab w:val="left" w:pos="567"/>
-              </w:tabs>
-              <w:spacing w:before="60" w:after="60" w:line="276" w:lineRule="auto"/>
-              <w:rPr>
-                <w:rFonts w:ascii="Times New Roman" w:hAnsi="Times New Roman" w:cs="Times New Roman"/>
-                <w:b/>
-                <w:sz w:val="26"/>
-                <w:szCs w:val="26"/>
-                <w:lang w:val="vi-VN"/>
-              </w:rPr>
-            </w:pPr>
-            <w:r>
-              <w:rPr>
-                <w:rFonts w:ascii="Times New Roman" w:hAnsi="Times New Roman" w:cs="Times New Roman"/>
-                <w:b/>
-                <w:sz w:val="26"/>
-                <w:szCs w:val="26"/>
-                <w:lang w:val="vi-VN"/>
-              </w:rPr>
-              <w:t>Tên chỉ số</w:t>
-            </w:r>
-          </w:p>
-        </w:tc>
-        <w:tc>
-          <w:tcPr>
-            <w:tcW w:w="7711" w:type="dxa"/>
-          </w:tcPr>
-          <w:p>
-            <w:pPr>
-              <w:tabs>
-                <w:tab w:val="left" w:pos="567"/>
-              </w:tabs>
-              <w:spacing w:before="60" w:after="60"/>
-              <w:jc w:val="both"/>
-              <w:rPr>
-                <w:rFonts w:ascii="Times New Roman" w:hAnsi="Times New Roman" w:cs="Times New Roman"/>
-                <w:b/>
-                <w:sz w:val="26"/>
-                <w:szCs w:val="26"/>
-                <w:lang w:val="vi-VN"/>
-              </w:rPr>
-            </w:pPr>
-            <w:r>
-              <w:rPr>
-                <w:rFonts w:ascii="Times New Roman" w:hAnsi="Times New Roman" w:cs="Times New Roman"/>
-                <w:color w:val="FF0000"/>
-                <w:sz w:val="26"/>
-                <w:szCs w:val="26"/>
-                <w:lang w:val="vi-VN"/>
-              </w:rPr>
-              <w:t>Số lượng người bệnh nội trú ăn suất ăn tại khoa Dinh dưỡng.</w:t>
-            </w:r>
-          </w:p>
-        </w:tc>
-      </w:tr>
-      <w:tr>
-        <w:tc>
-          <w:tcPr>
-            <w:tcW w:w="1991" w:type="dxa"/>
-          </w:tcPr>
-          <w:p>
-            <w:pPr>
-              <w:tabs>
-                <w:tab w:val="left" w:pos="567"/>
-              </w:tabs>
-              <w:spacing w:before="60" w:after="60" w:line="276" w:lineRule="auto"/>
-              <w:rPr>
-                <w:rFonts w:ascii="Times New Roman" w:hAnsi="Times New Roman" w:cs="Times New Roman"/>
-                <w:b/>
-                <w:sz w:val="26"/>
-                <w:szCs w:val="26"/>
-                <w:lang w:val="vi-VN"/>
-              </w:rPr>
-            </w:pPr>
-            <w:r>
-              <w:rPr>
-                <w:rFonts w:ascii="Times New Roman" w:hAnsi="Times New Roman" w:cs="Times New Roman"/>
-                <w:b/>
-                <w:sz w:val="26"/>
-                <w:szCs w:val="26"/>
-                <w:lang w:val="vi-VN"/>
-              </w:rPr>
-              <w:t>Định nghĩa chỉ số</w:t>
-            </w:r>
-          </w:p>
-        </w:tc>
-        <w:tc>
-          <w:tcPr>
-            <w:tcW w:w="7711" w:type="dxa"/>
-          </w:tcPr>
-          <w:p>
-            <w:pPr>
-              <w:tabs>
-                <w:tab w:val="left" w:pos="567"/>
-              </w:tabs>
-              <w:spacing w:before="60" w:after="60"/>
-              <w:jc w:val="both"/>
-              <w:rPr>
-                <w:rFonts w:ascii="Times New Roman" w:hAnsi="Times New Roman" w:cs="Times New Roman"/>
-                <w:sz w:val="26"/>
-                <w:szCs w:val="26"/>
-                <w:lang w:val="vi-VN"/>
-              </w:rPr>
-            </w:pPr>
-            <w:r>
-              <w:rPr>
-                <w:rFonts w:ascii="Times New Roman" w:hAnsi="Times New Roman" w:cs="Times New Roman"/>
-                <w:sz w:val="26"/>
-                <w:szCs w:val="26"/>
-                <w:lang w:val="vi-VN"/>
-              </w:rPr>
-              <w:t>Là công cụ để đo lường chất lượng phục vụ suất ăn tại khoa Dinh dưỡng.</w:t>
-            </w:r>
-          </w:p>
-        </w:tc>
-      </w:tr>
-      <w:tr>
-        <w:tc>
-          <w:tcPr>
-            <w:tcW w:w="1991" w:type="dxa"/>
-          </w:tcPr>
-          <w:p>
-            <w:pPr>
-              <w:tabs>
-                <w:tab w:val="left" w:pos="567"/>
-              </w:tabs>
-              <w:spacing w:before="60" w:after="60" w:line="276" w:lineRule="auto"/>
-              <w:rPr>
-                <w:rFonts w:ascii="Times New Roman" w:hAnsi="Times New Roman" w:cs="Times New Roman"/>
-                <w:b/>
-                <w:sz w:val="26"/>
-                <w:szCs w:val="26"/>
-                <w:lang w:val="vi-VN"/>
-              </w:rPr>
-            </w:pPr>
-            <w:r>
-              <w:rPr>
-                <w:rFonts w:ascii="Times New Roman" w:hAnsi="Times New Roman" w:cs="Times New Roman"/>
-                <w:b/>
-                <w:sz w:val="26"/>
-                <w:szCs w:val="26"/>
-                <w:lang w:val="vi-VN"/>
-              </w:rPr>
-              <w:t>Lĩnh vực áp dụng</w:t>
-            </w:r>
-          </w:p>
-        </w:tc>
-        <w:tc>
-          <w:tcPr>
-            <w:tcW w:w="7711" w:type="dxa"/>
-          </w:tcPr>
-          <w:p>
-            <w:pPr>
-              <w:tabs>
-                <w:tab w:val="left" w:pos="567"/>
-              </w:tabs>
-              <w:spacing w:before="60" w:after="60"/>
-              <w:jc w:val="both"/>
-              <w:rPr>
-                <w:rFonts w:ascii="Times New Roman" w:hAnsi="Times New Roman" w:cs="Times New Roman"/>
-                <w:sz w:val="26"/>
-                <w:szCs w:val="26"/>
-                <w:lang w:val="vi-VN"/>
-              </w:rPr>
-            </w:pPr>
-            <w:r>
-              <w:rPr>
-                <w:rFonts w:ascii="Times New Roman" w:hAnsi="Times New Roman" w:cs="Times New Roman"/>
-                <w:sz w:val="26"/>
-                <w:szCs w:val="26"/>
-                <w:lang w:val="vi-VN"/>
-              </w:rPr>
-              <w:t>Cung cấp suất ăn dinh dưỡng.</w:t>
-            </w:r>
-          </w:p>
-        </w:tc>
-      </w:tr>
-      <w:tr>
-        <w:tc>
-          <w:tcPr>
-            <w:tcW w:w="1991" w:type="dxa"/>
-          </w:tcPr>
-          <w:p>
-            <w:pPr>
-              <w:tabs>
-                <w:tab w:val="left" w:pos="567"/>
-              </w:tabs>
-              <w:spacing w:before="60" w:after="60" w:line="276" w:lineRule="auto"/>
-              <w:rPr>
-                <w:rFonts w:ascii="Times New Roman" w:hAnsi="Times New Roman" w:cs="Times New Roman"/>
-                <w:b/>
-                <w:sz w:val="26"/>
-                <w:szCs w:val="26"/>
-                <w:lang w:val="vi-VN"/>
-              </w:rPr>
-            </w:pPr>
-            <w:r>
-              <w:rPr>
-                <w:rFonts w:ascii="Times New Roman" w:hAnsi="Times New Roman" w:cs="Times New Roman"/>
-                <w:b/>
-                <w:sz w:val="26"/>
-                <w:szCs w:val="26"/>
-                <w:lang w:val="vi-VN"/>
-              </w:rPr>
-              <w:t>Khía cạnh chất lượng</w:t>
-            </w:r>
-          </w:p>
-        </w:tc>
-        <w:tc>
-          <w:tcPr>
-            <w:tcW w:w="7711" w:type="dxa"/>
-          </w:tcPr>
-          <w:p>
-            <w:pPr>
-              <w:tabs>
-                <w:tab w:val="left" w:pos="567"/>
-              </w:tabs>
-              <w:spacing w:before="60" w:after="60"/>
-              <w:jc w:val="both"/>
-              <w:rPr>
-                <w:rFonts w:ascii="Times New Roman" w:hAnsi="Times New Roman" w:cs="Times New Roman"/>
-                <w:sz w:val="26"/>
-                <w:szCs w:val="26"/>
-                <w:lang w:val="vi-VN"/>
-              </w:rPr>
-            </w:pPr>
-            <w:r>
-              <w:rPr>
-                <w:rFonts w:ascii="Times New Roman" w:hAnsi="Times New Roman" w:cs="Times New Roman"/>
-                <w:sz w:val="26"/>
-                <w:szCs w:val="26"/>
-                <w:lang w:val="vi-VN"/>
-              </w:rPr>
-              <w:t>Hài lòng người bệnh về chất lượng bữa ăn của bệnh viện.</w:t>
-            </w:r>
-          </w:p>
-        </w:tc>
-      </w:tr>
-      <w:tr>
-        <w:tc>
-          <w:tcPr>
-            <w:tcW w:w="1991" w:type="dxa"/>
-          </w:tcPr>
-          <w:p>
-            <w:pPr>
-              <w:tabs>
-                <w:tab w:val="left" w:pos="567"/>
-              </w:tabs>
-              <w:spacing w:before="60" w:after="60" w:line="276" w:lineRule="auto"/>
-              <w:rPr>
-                <w:rFonts w:ascii="Times New Roman" w:hAnsi="Times New Roman" w:cs="Times New Roman"/>
-                <w:b/>
-                <w:sz w:val="26"/>
-                <w:szCs w:val="26"/>
-                <w:lang w:val="vi-VN"/>
-              </w:rPr>
-            </w:pPr>
-            <w:r>
-              <w:rPr>
-                <w:rFonts w:ascii="Times New Roman" w:hAnsi="Times New Roman" w:cs="Times New Roman"/>
-                <w:b/>
-                <w:sz w:val="26"/>
-                <w:szCs w:val="26"/>
-                <w:lang w:val="vi-VN"/>
-              </w:rPr>
-              <w:t>Thành tố chất lượng</w:t>
-            </w:r>
-          </w:p>
-        </w:tc>
-        <w:tc>
-          <w:tcPr>
-            <w:tcW w:w="7711" w:type="dxa"/>
-          </w:tcPr>
-          <w:p>
-            <w:pPr>
-              <w:pStyle w:val="ListParagraph"/>
-              <w:ind w:left="360"/>
-              <w:jc w:val="both"/>
-              <w:rPr>
-                <w:rFonts w:ascii="Times New Roman" w:hAnsi="Times New Roman" w:cs="Times New Roman"/>
-                <w:i/>
-                <w:color w:val="FF0000"/>
-                <w:sz w:val="26"/>
-                <w:szCs w:val="26"/>
-                <w:u w:val="single"/>
-                <w:lang w:val="vi-VN"/>
-              </w:rPr>
-            </w:pPr>
-            <w:r>
-              <w:rPr>
-                <w:rFonts w:ascii="Times New Roman" w:hAnsi="Times New Roman" w:cs="Times New Roman"/>
-                <w:sz w:val="26"/>
-                <w:szCs w:val="26"/>
-                <w:u w:val="single"/>
-                <w:lang w:val="vi-VN"/>
-              </w:rPr>
-              <w:t>Đầu ra</w:t>
-            </w:r>
-            <w:r>
-              <w:rPr>
-                <w:rFonts w:ascii="Times New Roman" w:hAnsi="Times New Roman" w:cs="Times New Roman"/>
-                <w:i/>
-                <w:color w:val="FF0000"/>
-                <w:sz w:val="26"/>
-                <w:szCs w:val="26"/>
-                <w:u w:val="single"/>
-                <w:lang w:val="vi-VN"/>
-              </w:rPr>
-              <w:t xml:space="preserve"> </w:t>
-            </w:r>
-          </w:p>
-        </w:tc>
-      </w:tr>
-      <w:tr>
-        <w:tc>
-          <w:tcPr>
-            <w:tcW w:w="1991" w:type="dxa"/>
-          </w:tcPr>
-          <w:p>
-            <w:pPr>
-              <w:tabs>
-                <w:tab w:val="left" w:pos="567"/>
-              </w:tabs>
-              <w:spacing w:before="60" w:after="60" w:line="276" w:lineRule="auto"/>
-              <w:rPr>
-                <w:rFonts w:ascii="Times New Roman" w:hAnsi="Times New Roman" w:cs="Times New Roman"/>
-                <w:b/>
-                <w:sz w:val="26"/>
-                <w:szCs w:val="26"/>
-                <w:lang w:val="vi-VN"/>
-              </w:rPr>
-            </w:pPr>
-            <w:r>
-              <w:rPr>
-                <w:rFonts w:ascii="Times New Roman" w:hAnsi="Times New Roman" w:cs="Times New Roman"/>
-                <w:b/>
-                <w:sz w:val="26"/>
-                <w:szCs w:val="26"/>
-                <w:lang w:val="vi-VN"/>
-              </w:rPr>
-              <w:t>Lý do lựa chọn</w:t>
-            </w:r>
-          </w:p>
-        </w:tc>
-        <w:tc>
-          <w:tcPr>
-            <w:tcW w:w="7711" w:type="dxa"/>
-          </w:tcPr>
-          <w:p>
-            <w:pPr>
-              <w:tabs>
-                <w:tab w:val="left" w:pos="567"/>
-              </w:tabs>
-              <w:spacing w:before="60" w:after="60"/>
-              <w:rPr>
-                <w:rFonts w:ascii="Times New Roman" w:hAnsi="Times New Roman" w:cs="Times New Roman"/>
-                <w:sz w:val="26"/>
-                <w:szCs w:val="26"/>
-                <w:lang w:val="vi-VN"/>
-              </w:rPr>
-            </w:pPr>
-            <w:r>
-              <w:rPr>
-                <w:rFonts w:ascii="Times New Roman" w:hAnsi="Times New Roman" w:cs="Times New Roman"/>
-                <w:sz w:val="26"/>
-                <w:szCs w:val="26"/>
-                <w:lang w:val="vi-VN"/>
-              </w:rPr>
-              <w:t>Lý do lựa chọn: mong muốn cải thiên tình trạng dinh dưỡng cho người bệnh ung thư, cải thiện chất lượng cuộc sống cho người bệnh.</w:t>
-            </w:r>
-          </w:p>
-        </w:tc>
-      </w:tr>
-      <w:tr>
-        <w:tc>
-          <w:tcPr>
-            <w:tcW w:w="1991" w:type="dxa"/>
-          </w:tcPr>
-          <w:p>
-            <w:pPr>
-              <w:tabs>
-                <w:tab w:val="left" w:pos="567"/>
-              </w:tabs>
-              <w:spacing w:before="60" w:after="60" w:line="276" w:lineRule="auto"/>
-              <w:rPr>
-                <w:rFonts w:ascii="Times New Roman" w:hAnsi="Times New Roman" w:cs="Times New Roman"/>
-                <w:b/>
-                <w:sz w:val="26"/>
-                <w:szCs w:val="26"/>
-                <w:lang w:val="vi-VN"/>
-              </w:rPr>
-            </w:pPr>
-            <w:r>
-              <w:rPr>
-                <w:rFonts w:ascii="Times New Roman" w:hAnsi="Times New Roman" w:cs="Times New Roman"/>
-                <w:b/>
-                <w:sz w:val="26"/>
-                <w:szCs w:val="26"/>
-                <w:lang w:val="vi-VN"/>
-              </w:rPr>
-              <w:t>Phương pháp tính</w:t>
-            </w:r>
-          </w:p>
-        </w:tc>
-        <w:tc>
-          <w:tcPr>
-            <w:tcW w:w="7711" w:type="dxa"/>
-          </w:tcPr>
-          <w:p>
-            <w:pPr>
-              <w:pStyle w:val="ListParagraph"/>
-              <w:tabs>
-                <w:tab w:val="left" w:pos="567"/>
-              </w:tabs>
-              <w:spacing w:before="60" w:after="60"/>
-              <w:ind w:left="360"/>
-              <w:jc w:val="both"/>
-              <w:rPr>
-                <w:rFonts w:ascii="Times New Roman" w:hAnsi="Times New Roman" w:cs="Times New Roman"/>
-                <w:sz w:val="26"/>
-                <w:szCs w:val="26"/>
-                <w:lang w:val="vi-VN"/>
-              </w:rPr>
-            </w:pPr>
-          </w:p>
-          <w:p>
-            <w:pPr>
-              <w:pStyle w:val="ListParagraph"/>
-              <w:tabs>
-                <w:tab w:val="left" w:pos="567"/>
-              </w:tabs>
-              <w:spacing w:before="60" w:after="60"/>
-              <w:ind w:left="360"/>
-              <w:jc w:val="both"/>
-              <w:rPr>
-                <w:rFonts w:ascii="Times New Roman" w:hAnsi="Times New Roman" w:cs="Times New Roman"/>
-                <w:sz w:val="26"/>
-                <w:szCs w:val="26"/>
-                <w:lang w:val="vi-VN"/>
-              </w:rPr>
-            </w:pPr>
-          </w:p>
-        </w:tc>
-      </w:tr>
-      <w:tr>
-        <w:tc>
-          <w:tcPr>
-            <w:tcW w:w="1991" w:type="dxa"/>
-          </w:tcPr>
-          <w:p>
-            <w:pPr>
-              <w:tabs>
-                <w:tab w:val="left" w:pos="567"/>
-              </w:tabs>
-              <w:spacing w:before="60" w:after="60" w:line="276" w:lineRule="auto"/>
-              <w:jc w:val="right"/>
-              <w:rPr>
-                <w:rFonts w:ascii="Times New Roman" w:hAnsi="Times New Roman" w:cs="Times New Roman"/>
-                <w:i/>
-                <w:sz w:val="26"/>
-                <w:szCs w:val="26"/>
-                <w:lang w:val="vi-VN"/>
-              </w:rPr>
-            </w:pPr>
-            <w:r>
-              <w:rPr>
-                <w:rFonts w:ascii="Times New Roman" w:hAnsi="Times New Roman" w:cs="Times New Roman"/>
-                <w:i/>
-                <w:sz w:val="26"/>
-                <w:szCs w:val="26"/>
-                <w:lang w:val="vi-VN"/>
-              </w:rPr>
-              <w:lastRenderedPageBreak/>
-              <w:t>Tử số</w:t>
-            </w:r>
-          </w:p>
-        </w:tc>
-        <w:tc>
-          <w:tcPr>
-            <w:tcW w:w="7711" w:type="dxa"/>
-          </w:tcPr>
-          <w:p>
-            <w:pPr>
-              <w:tabs>
-                <w:tab w:val="left" w:pos="567"/>
-              </w:tabs>
-              <w:spacing w:before="60" w:after="60"/>
-              <w:jc w:val="both"/>
-              <w:rPr>
-                <w:rFonts w:ascii="Times New Roman" w:hAnsi="Times New Roman" w:cs="Times New Roman"/>
-                <w:sz w:val="26"/>
-                <w:szCs w:val="26"/>
-                <w:lang w:val="vi-VN"/>
-              </w:rPr>
-            </w:pPr>
-            <w:r>
-              <w:rPr>
-                <w:rFonts w:ascii="Times New Roman" w:hAnsi="Times New Roman" w:cs="Times New Roman"/>
-                <w:sz w:val="26"/>
-                <w:szCs w:val="26"/>
-                <w:lang w:val="vi-VN"/>
-              </w:rPr>
-              <w:t>Số lượng bệnh nhân ăn suất ăn tại khoa Dinh dưỡng.</w:t>
-            </w:r>
-          </w:p>
-        </w:tc>
-      </w:tr>
-      <w:tr>
-        <w:tc>
-          <w:tcPr>
-            <w:tcW w:w="1991" w:type="dxa"/>
-          </w:tcPr>
-          <w:p>
-            <w:pPr>
-              <w:tabs>
-                <w:tab w:val="left" w:pos="567"/>
-              </w:tabs>
-              <w:spacing w:before="60" w:after="60" w:line="276" w:lineRule="auto"/>
-              <w:jc w:val="right"/>
-              <w:rPr>
-                <w:rFonts w:ascii="Times New Roman" w:hAnsi="Times New Roman" w:cs="Times New Roman"/>
-                <w:i/>
-                <w:sz w:val="26"/>
-                <w:szCs w:val="26"/>
-                <w:lang w:val="vi-VN"/>
-              </w:rPr>
-            </w:pPr>
-            <w:r>
-              <w:rPr>
-                <w:rFonts w:ascii="Times New Roman" w:hAnsi="Times New Roman" w:cs="Times New Roman"/>
-                <w:i/>
-                <w:sz w:val="26"/>
-                <w:szCs w:val="26"/>
-                <w:lang w:val="vi-VN"/>
-              </w:rPr>
-              <w:t>Mẫu số</w:t>
-            </w:r>
-          </w:p>
-        </w:tc>
-        <w:tc>
-          <w:tcPr>
-            <w:tcW w:w="7711" w:type="dxa"/>
-          </w:tcPr>
-          <w:p>
-            <w:pPr>
-              <w:tabs>
-                <w:tab w:val="left" w:pos="567"/>
-              </w:tabs>
-              <w:spacing w:before="60" w:after="60"/>
-              <w:jc w:val="both"/>
-              <w:rPr>
-                <w:rFonts w:ascii="Times New Roman" w:hAnsi="Times New Roman" w:cs="Times New Roman"/>
-                <w:sz w:val="26"/>
-                <w:szCs w:val="26"/>
-                <w:lang w:val="vi-VN"/>
-              </w:rPr>
-            </w:pPr>
-            <w:r>
-              <w:rPr>
-                <w:rFonts w:ascii="Times New Roman" w:hAnsi="Times New Roman" w:cs="Times New Roman"/>
-                <w:sz w:val="26"/>
-                <w:szCs w:val="26"/>
-                <w:lang w:val="vi-VN"/>
-              </w:rPr>
-              <w:t>Số lượng bệnh nội trú.</w:t>
-            </w:r>
-          </w:p>
-        </w:tc>
-      </w:tr>
-      <w:tr>
-        <w:tc>
-          <w:tcPr>
-            <w:tcW w:w="1991" w:type="dxa"/>
-          </w:tcPr>
-          <w:p>
-            <w:pPr>
-              <w:tabs>
-                <w:tab w:val="left" w:pos="567"/>
-              </w:tabs>
-              <w:spacing w:before="60" w:after="60" w:line="276" w:lineRule="auto"/>
-              <w:rPr>
-                <w:rFonts w:ascii="Times New Roman" w:hAnsi="Times New Roman" w:cs="Times New Roman"/>
-                <w:b/>
-                <w:sz w:val="26"/>
-                <w:szCs w:val="26"/>
-                <w:lang w:val="vi-VN"/>
-              </w:rPr>
-            </w:pPr>
-            <w:r>
-              <w:rPr>
-                <w:rFonts w:ascii="Times New Roman" w:hAnsi="Times New Roman" w:cs="Times New Roman"/>
-                <w:b/>
-                <w:sz w:val="26"/>
-                <w:szCs w:val="26"/>
-                <w:lang w:val="vi-VN"/>
-              </w:rPr>
-              <w:t>Nguồn số liệu</w:t>
-            </w:r>
-          </w:p>
-        </w:tc>
-        <w:tc>
-          <w:tcPr>
-            <w:tcW w:w="7711" w:type="dxa"/>
-          </w:tcPr>
-          <w:p>
-            <w:pPr>
-              <w:tabs>
-                <w:tab w:val="left" w:pos="567"/>
-              </w:tabs>
-              <w:spacing w:before="60" w:after="60"/>
-              <w:jc w:val="both"/>
-              <w:rPr>
-                <w:rFonts w:ascii="Times New Roman" w:hAnsi="Times New Roman" w:cs="Times New Roman"/>
-                <w:sz w:val="26"/>
-                <w:szCs w:val="26"/>
-                <w:lang w:val="vi-VN"/>
-              </w:rPr>
-            </w:pPr>
-            <w:r>
-              <w:rPr>
-                <w:rFonts w:ascii="Times New Roman" w:hAnsi="Times New Roman" w:cs="Times New Roman"/>
-                <w:sz w:val="26"/>
-                <w:szCs w:val="26"/>
-                <w:lang w:val="vi-VN"/>
-              </w:rPr>
-              <w:t>Người đăng kí suất ăn của khoa dinh dưỡng.</w:t>
-            </w:r>
-          </w:p>
-        </w:tc>
-      </w:tr>
-      <w:tr>
-        <w:tc>
-          <w:tcPr>
-            <w:tcW w:w="1991" w:type="dxa"/>
-          </w:tcPr>
-          <w:p>
-            <w:pPr>
-              <w:tabs>
-                <w:tab w:val="left" w:pos="567"/>
-              </w:tabs>
-              <w:spacing w:before="60" w:after="60" w:line="276" w:lineRule="auto"/>
-              <w:rPr>
-                <w:rFonts w:ascii="Times New Roman" w:hAnsi="Times New Roman" w:cs="Times New Roman"/>
-                <w:b/>
-                <w:sz w:val="26"/>
-                <w:szCs w:val="26"/>
-                <w:lang w:val="vi-VN"/>
-              </w:rPr>
-            </w:pPr>
-            <w:r>
-              <w:rPr>
-                <w:rFonts w:ascii="Times New Roman" w:hAnsi="Times New Roman" w:cs="Times New Roman"/>
-                <w:b/>
-                <w:sz w:val="26"/>
-                <w:szCs w:val="26"/>
-                <w:lang w:val="vi-VN"/>
-              </w:rPr>
-              <w:t>Thu thập và tổng hợp số liệu</w:t>
-            </w:r>
-          </w:p>
-        </w:tc>
-        <w:tc>
-          <w:tcPr>
-            <w:tcW w:w="7711" w:type="dxa"/>
-          </w:tcPr>
-          <w:p>
-            <w:pPr>
-              <w:tabs>
-                <w:tab w:val="left" w:pos="567"/>
-              </w:tabs>
-              <w:spacing w:before="60" w:after="60"/>
-              <w:jc w:val="both"/>
-              <w:rPr>
-                <w:rFonts w:ascii="Times New Roman" w:hAnsi="Times New Roman" w:cs="Times New Roman"/>
-                <w:sz w:val="26"/>
-                <w:szCs w:val="26"/>
-                <w:lang w:val="vi-VN"/>
-              </w:rPr>
-            </w:pPr>
-            <w:r>
-              <w:rPr>
-                <w:rFonts w:ascii="Times New Roman" w:hAnsi="Times New Roman" w:cs="Times New Roman"/>
-                <w:sz w:val="26"/>
-                <w:szCs w:val="26"/>
-                <w:lang w:val="vi-VN"/>
-              </w:rPr>
-              <w:t>Hiện nay, bệnh viện đang thu thập và tổng hợp số liệu.</w:t>
-            </w:r>
-          </w:p>
-        </w:tc>
-      </w:tr>
-      <w:tr>
-        <w:tc>
-          <w:tcPr>
-            <w:tcW w:w="1991" w:type="dxa"/>
-          </w:tcPr>
-          <w:p>
-            <w:pPr>
-              <w:tabs>
-                <w:tab w:val="left" w:pos="567"/>
-              </w:tabs>
-              <w:spacing w:before="60" w:after="60" w:line="276" w:lineRule="auto"/>
-              <w:rPr>
-                <w:rFonts w:ascii="Times New Roman" w:hAnsi="Times New Roman" w:cs="Times New Roman"/>
-                <w:b/>
-                <w:sz w:val="26"/>
-                <w:szCs w:val="26"/>
-                <w:lang w:val="vi-VN"/>
-              </w:rPr>
-            </w:pPr>
-            <w:r>
-              <w:rPr>
-                <w:rFonts w:ascii="Times New Roman" w:hAnsi="Times New Roman" w:cs="Times New Roman"/>
-                <w:b/>
-                <w:sz w:val="26"/>
-                <w:szCs w:val="26"/>
-                <w:lang w:val="vi-VN"/>
-              </w:rPr>
-              <w:t>Giá trị của số liệu</w:t>
-            </w:r>
-          </w:p>
-        </w:tc>
-        <w:tc>
-          <w:tcPr>
-            <w:tcW w:w="7711" w:type="dxa"/>
-          </w:tcPr>
-          <w:p>
-            <w:pPr>
-              <w:tabs>
-                <w:tab w:val="left" w:pos="567"/>
-              </w:tabs>
-              <w:spacing w:before="60" w:after="60"/>
-              <w:jc w:val="both"/>
-              <w:rPr>
-                <w:rFonts w:ascii="Times New Roman" w:hAnsi="Times New Roman" w:cs="Times New Roman"/>
-                <w:sz w:val="26"/>
-                <w:szCs w:val="26"/>
-                <w:lang w:val="vi-VN"/>
-              </w:rPr>
-            </w:pPr>
-            <w:r>
-              <w:rPr>
-                <w:rFonts w:ascii="Times New Roman" w:hAnsi="Times New Roman" w:cs="Times New Roman"/>
-                <w:sz w:val="26"/>
-                <w:szCs w:val="26"/>
-                <w:lang w:val="vi-VN"/>
-              </w:rPr>
-              <w:t>Độ chính xác cao vì lấy số liệu thực tế.</w:t>
-            </w:r>
-          </w:p>
-        </w:tc>
-      </w:tr>
-      <w:tr>
-        <w:tc>
-          <w:tcPr>
-            <w:tcW w:w="1991" w:type="dxa"/>
-          </w:tcPr>
-          <w:p>
-            <w:pPr>
-              <w:tabs>
-                <w:tab w:val="left" w:pos="567"/>
-              </w:tabs>
-              <w:spacing w:before="60" w:after="60" w:line="276" w:lineRule="auto"/>
-              <w:rPr>
-                <w:rFonts w:ascii="Times New Roman" w:hAnsi="Times New Roman" w:cs="Times New Roman"/>
-                <w:b/>
-                <w:sz w:val="26"/>
-                <w:szCs w:val="26"/>
-                <w:lang w:val="vi-VN"/>
-              </w:rPr>
-            </w:pPr>
-            <w:r>
-              <w:rPr>
-                <w:rFonts w:ascii="Times New Roman" w:hAnsi="Times New Roman" w:cs="Times New Roman"/>
-                <w:b/>
-                <w:sz w:val="26"/>
-                <w:szCs w:val="26"/>
-                <w:lang w:val="vi-VN"/>
-              </w:rPr>
-              <w:t>Tần suất báo cáo</w:t>
-            </w:r>
-          </w:p>
-        </w:tc>
-        <w:tc>
-          <w:tcPr>
-            <w:tcW w:w="7711" w:type="dxa"/>
-          </w:tcPr>
-          <w:p>
-            <w:pPr>
-              <w:tabs>
-                <w:tab w:val="left" w:pos="567"/>
-              </w:tabs>
-              <w:spacing w:before="60" w:after="60"/>
-              <w:jc w:val="both"/>
-              <w:rPr>
-                <w:rFonts w:ascii="Times New Roman" w:hAnsi="Times New Roman" w:cs="Times New Roman"/>
-                <w:sz w:val="26"/>
-                <w:szCs w:val="26"/>
-                <w:lang w:val="vi-VN"/>
-              </w:rPr>
-            </w:pPr>
-            <w:r>
-              <w:rPr>
-                <w:rFonts w:ascii="Times New Roman" w:hAnsi="Times New Roman" w:cs="Times New Roman"/>
-                <w:sz w:val="26"/>
-                <w:szCs w:val="26"/>
-                <w:lang w:val="vi-VN"/>
-              </w:rPr>
-              <w:t>Mỗi quý.</w:t>
-            </w:r>
-          </w:p>
-        </w:tc>
-      </w:tr>
-      <w:tr>
-        <w:tc>
-          <w:tcPr>
-            <w:tcW w:w="1991" w:type="dxa"/>
-          </w:tcPr>
-          <w:p>
-            <w:pPr>
-              <w:tabs>
-                <w:tab w:val="left" w:pos="567"/>
-              </w:tabs>
-              <w:spacing w:before="60" w:after="60" w:line="276" w:lineRule="auto"/>
-              <w:rPr>
-                <w:rFonts w:ascii="Times New Roman" w:hAnsi="Times New Roman" w:cs="Times New Roman"/>
-                <w:b/>
-                <w:sz w:val="26"/>
-                <w:szCs w:val="26"/>
-                <w:lang w:val="vi-VN"/>
-              </w:rPr>
-            </w:pPr>
-            <w:r>
-              <w:rPr>
-                <w:rFonts w:ascii="Times New Roman" w:hAnsi="Times New Roman" w:cs="Times New Roman"/>
-                <w:b/>
-                <w:sz w:val="26"/>
-                <w:szCs w:val="26"/>
-                <w:lang w:val="vi-VN"/>
-              </w:rPr>
-              <w:t>Mục tiêu đạt được trong năm 2020</w:t>
-            </w:r>
-          </w:p>
-        </w:tc>
-        <w:tc>
-          <w:tcPr>
-            <w:tcW w:w="7711" w:type="dxa"/>
-          </w:tcPr>
-          <w:p>
-            <w:pPr>
-              <w:tabs>
-                <w:tab w:val="left" w:pos="567"/>
-              </w:tabs>
-              <w:spacing w:before="60" w:after="60"/>
-              <w:jc w:val="both"/>
-              <w:rPr>
-                <w:rFonts w:ascii="Times New Roman" w:hAnsi="Times New Roman" w:cs="Times New Roman"/>
-                <w:sz w:val="26"/>
-                <w:szCs w:val="26"/>
-                <w:lang w:val="vi-VN"/>
-              </w:rPr>
-            </w:pPr>
-            <w:r>
-              <w:rPr>
-                <w:rFonts w:ascii="Times New Roman" w:hAnsi="Times New Roman" w:cs="Times New Roman"/>
-                <w:sz w:val="26"/>
-                <w:szCs w:val="26"/>
-                <w:lang w:val="vi-VN"/>
-              </w:rPr>
-              <w:t>Đạt  tỷ lệ &gt;50 %.</w:t>
-            </w:r>
-          </w:p>
-        </w:tc>
-      </w:tr>
-    </w:tbl>
-    <w:p>
-      <w:pPr>
-        <w:spacing w:before="240"/>
-        <w:jc w:val="both"/>
-        <w:rPr>
-          <w:rFonts w:ascii="Times New Roman" w:hAnsi="Times New Roman" w:cs="Times New Roman"/>
-          <w:b/>
-          <w:bCs/>
-          <w:sz w:val="28"/>
-          <w:szCs w:val="28"/>
-        </w:rPr>
-      </w:pPr>
-      <w:r>
-        <w:rPr>
-          <w:rFonts w:ascii="Times New Roman" w:hAnsi="Times New Roman" w:cs="Times New Roman"/>
-          <w:b/>
-          <w:bCs/>
-          <w:sz w:val="28"/>
-          <w:szCs w:val="28"/>
-        </w:rPr>
         <w:t>14.</w:t>
       </w:r>
     </w:p>
@@ -7361,6 +6434,7 @@
                 <w:szCs w:val="28"/>
                 <w:lang w:val="vi-VN"/>
               </w:rPr>
+              <w:lastRenderedPageBreak/>
               <w:t>Phương pháp tính</w:t>
             </w:r>
           </w:p>
@@ -7487,7 +6561,6 @@
                 <w:szCs w:val="28"/>
                 <w:lang w:val="vi-VN"/>
               </w:rPr>
-              <w:lastRenderedPageBreak/>
               <w:t>Mẫu số</w:t>
             </w:r>
           </w:p>
@@ -8238,38 +7311,49 @@
                 <w:szCs w:val="26"/>
                 <w:lang w:val="vi-VN"/>
               </w:rPr>
-              <w:t>Lý do lựa chọn: mong muốn cải thiện tình trạng dinh dưỡng cho người bệnh ung thư, cải thiện chất lượng cuộc sống cho người bệnh, cũng như tăng cường kiến thức cho nhân viên y tế trong đánh giá, truyền thông dinh dưỡng cho người bệnh.</w:t>
-            </w:r>
-          </w:p>
-        </w:tc>
-      </w:tr>
-      <w:tr>
-        <w:tc>
-          <w:tcPr>
-            <w:tcW w:w="1991" w:type="dxa"/>
-          </w:tcPr>
-          <w:p>
-            <w:pPr>
-              <w:tabs>
-                <w:tab w:val="left" w:pos="567"/>
-              </w:tabs>
-              <w:spacing w:before="60" w:after="60" w:line="276" w:lineRule="auto"/>
-              <w:rPr>
-                <w:rFonts w:ascii="Times New Roman" w:hAnsi="Times New Roman" w:cs="Times New Roman"/>
-                <w:b/>
-                <w:sz w:val="26"/>
-                <w:szCs w:val="26"/>
-                <w:lang w:val="vi-VN"/>
-              </w:rPr>
-            </w:pPr>
-            <w:r>
-              <w:rPr>
-                <w:rFonts w:ascii="Times New Roman" w:hAnsi="Times New Roman" w:cs="Times New Roman"/>
-                <w:b/>
-                <w:sz w:val="26"/>
-                <w:szCs w:val="26"/>
-                <w:lang w:val="vi-VN"/>
-              </w:rPr>
+              <w:t xml:space="preserve">Lý do lựa chọn: mong muốn cải thiện tình trạng dinh dưỡng cho người bệnh ung thư, cải thiện chất lượng cuộc sống cho người bệnh, cũng như </w:t>
+            </w:r>
+            <w:r>
+              <w:rPr>
+                <w:rFonts w:ascii="Times New Roman" w:hAnsi="Times New Roman" w:cs="Times New Roman"/>
+                <w:sz w:val="26"/>
+                <w:szCs w:val="26"/>
+                <w:lang w:val="vi-VN"/>
+              </w:rPr>
+              <w:lastRenderedPageBreak/>
+              <w:t>tăng cường kiến thức cho nhân viên y tế trong đánh giá, truyền thông dinh dưỡng cho người bệnh.</w:t>
+            </w:r>
+          </w:p>
+        </w:tc>
+      </w:tr>
+      <w:tr>
+        <w:tc>
+          <w:tcPr>
+            <w:tcW w:w="1991" w:type="dxa"/>
+          </w:tcPr>
+          <w:p>
+            <w:pPr>
+              <w:tabs>
+                <w:tab w:val="left" w:pos="567"/>
+              </w:tabs>
+              <w:spacing w:before="60" w:after="60" w:line="276" w:lineRule="auto"/>
+              <w:rPr>
+                <w:rFonts w:ascii="Times New Roman" w:hAnsi="Times New Roman" w:cs="Times New Roman"/>
+                <w:b/>
+                <w:sz w:val="26"/>
+                <w:szCs w:val="26"/>
+                <w:lang w:val="vi-VN"/>
+              </w:rPr>
+            </w:pPr>
+            <w:r>
+              <w:rPr>
+                <w:rFonts w:ascii="Times New Roman" w:hAnsi="Times New Roman" w:cs="Times New Roman"/>
+                <w:b/>
+                <w:sz w:val="26"/>
+                <w:szCs w:val="26"/>
+                <w:lang w:val="vi-VN"/>
+              </w:rPr>
+              <w:lastRenderedPageBreak/>
               <w:t>Phương pháp tính</w:t>
             </w:r>
           </w:p>
@@ -8392,7 +7476,6 @@
                 <w:szCs w:val="26"/>
                 <w:lang w:val="vi-VN"/>
               </w:rPr>
-              <w:lastRenderedPageBreak/>
               <w:t>Thu thập và tổng hợp số liệu</w:t>
             </w:r>
           </w:p>
@@ -9053,6 +8136,7 @@
                 <w:szCs w:val="26"/>
                 <w:lang w:val="vi-VN"/>
               </w:rPr>
+              <w:lastRenderedPageBreak/>
               <w:t>Báo cáo phản ứng có hại trực tuyến thông qua trang web</w:t>
             </w:r>
           </w:p>
@@ -9085,6 +8169,7 @@
                 <w:szCs w:val="26"/>
                 <w:lang w:val="vi-VN"/>
               </w:rPr>
+              <w:lastRenderedPageBreak/>
               <w:t>Nguồn số liệu</w:t>
             </w:r>
           </w:p>
@@ -9199,7 +8284,6 @@
                 <w:szCs w:val="26"/>
                 <w:lang w:val="vi-VN"/>
               </w:rPr>
-              <w:lastRenderedPageBreak/>
               <w:t>Tổng hợp số liệu, đánh giá mức độ nặng, đánh giá phân loại xảy ra ADRs theo nhóm thuốc, đối tượng bệnh nhân.</w:t>
             </w:r>
           </w:p>
@@ -9232,7 +8316,6 @@
                 <w:szCs w:val="26"/>
                 <w:lang w:val="vi-VN"/>
               </w:rPr>
-              <w:lastRenderedPageBreak/>
               <w:t>Giá trị của số liệu</w:t>
             </w:r>
           </w:p>
@@ -9879,6 +8962,7 @@
                 <w:szCs w:val="26"/>
                 <w:lang w:val="vi-VN"/>
               </w:rPr>
+              <w:lastRenderedPageBreak/>
               <w:t>Lý do lựa chọn</w:t>
             </w:r>
           </w:p>
@@ -9909,49 +8993,38 @@
                 <w:lang w:val="vi-VN"/>
               </w:rPr>
               <w:tab/>
-              <w:t xml:space="preserve">Cải tiến chất lượng khám chữa bệnh vừa là mục tiêu vừa là nhiệm vụ trọng tâm và xuyên suốt, được tiến hành liên tục nhằm đáp ứng nhu cầu phục vụ an toàn, chu đáo, hiệu quả và đáp ứng kì vọng của người bệnh. Đây là vấn đề cấp bách cần xem xét, nghiên cứu, đánh giá một cách nghiêm túc và khoa học để tìm ra những giải pháp phù hợp nhằm </w:t>
-            </w:r>
-            <w:r>
-              <w:rPr>
-                <w:rFonts w:ascii="Times New Roman" w:hAnsi="Times New Roman" w:cs="Times New Roman"/>
-                <w:sz w:val="26"/>
-                <w:szCs w:val="26"/>
-                <w:lang w:val="vi-VN"/>
-              </w:rPr>
-              <w:lastRenderedPageBreak/>
-              <w:t>cải thiện và nâng cao sự tín nhiệm và hài lòng của người dân đối với bệnh viện.</w:t>
-            </w:r>
-          </w:p>
-        </w:tc>
-      </w:tr>
-      <w:tr>
-        <w:tc>
-          <w:tcPr>
-            <w:tcW w:w="1991" w:type="dxa"/>
-          </w:tcPr>
-          <w:p>
-            <w:pPr>
-              <w:tabs>
-                <w:tab w:val="left" w:pos="567"/>
-              </w:tabs>
-              <w:spacing w:before="60" w:after="60" w:line="276" w:lineRule="auto"/>
-              <w:rPr>
-                <w:rFonts w:ascii="Times New Roman" w:hAnsi="Times New Roman" w:cs="Times New Roman"/>
-                <w:b/>
-                <w:sz w:val="26"/>
-                <w:szCs w:val="26"/>
-                <w:lang w:val="vi-VN"/>
-              </w:rPr>
-            </w:pPr>
-            <w:r>
-              <w:rPr>
-                <w:rFonts w:ascii="Times New Roman" w:hAnsi="Times New Roman" w:cs="Times New Roman"/>
-                <w:b/>
-                <w:sz w:val="26"/>
-                <w:szCs w:val="26"/>
-                <w:lang w:val="vi-VN"/>
-              </w:rPr>
-              <w:lastRenderedPageBreak/>
+              <w:t>Cải tiến chất lượng khám chữa bệnh vừa là mục tiêu vừa là nhiệm vụ trọng tâm và xuyên suốt, được tiến hành liên tục nhằm đáp ứng nhu cầu phục vụ an toàn, chu đáo, hiệu quả và đáp ứng kì vọng của người bệnh. Đây là vấn đề cấp bách cần xem xét, nghiên cứu, đánh giá một cách nghiêm túc và khoa học để tìm ra những giải pháp phù hợp nhằm cải thiện và nâng cao sự tín nhiệm và hài lòng của người dân đối với bệnh viện.</w:t>
+            </w:r>
+          </w:p>
+        </w:tc>
+      </w:tr>
+      <w:tr>
+        <w:tc>
+          <w:tcPr>
+            <w:tcW w:w="1991" w:type="dxa"/>
+          </w:tcPr>
+          <w:p>
+            <w:pPr>
+              <w:tabs>
+                <w:tab w:val="left" w:pos="567"/>
+              </w:tabs>
+              <w:spacing w:before="60" w:after="60" w:line="276" w:lineRule="auto"/>
+              <w:rPr>
+                <w:rFonts w:ascii="Times New Roman" w:hAnsi="Times New Roman" w:cs="Times New Roman"/>
+                <w:b/>
+                <w:sz w:val="26"/>
+                <w:szCs w:val="26"/>
+                <w:lang w:val="vi-VN"/>
+              </w:rPr>
+            </w:pPr>
+            <w:r>
+              <w:rPr>
+                <w:rFonts w:ascii="Times New Roman" w:hAnsi="Times New Roman" w:cs="Times New Roman"/>
+                <w:b/>
+                <w:sz w:val="26"/>
+                <w:szCs w:val="26"/>
+                <w:lang w:val="vi-VN"/>
+              </w:rPr>
               <w:t>Phương pháp tính</w:t>
             </w:r>
           </w:p>
@@ -10528,15 +9601,7 @@
           <w:sz w:val="28"/>
           <w:szCs w:val="28"/>
         </w:rPr>
-        <w:t>Phòng</w:t>
-      </w:r>
-      <w:r>
-        <w:rPr>
-          <w:rFonts w:ascii="Times New Roman" w:hAnsi="Times New Roman" w:cs="Times New Roman"/>
-          <w:sz w:val="28"/>
-          <w:szCs w:val="28"/>
-        </w:rPr>
-        <w:t xml:space="preserve"> Kế hoạch</w:t>
+        <w:t>Phòng Kế hoạch</w:t>
       </w:r>
     </w:p>
     <w:p>
@@ -10725,6 +9790,7 @@
                 <w:szCs w:val="26"/>
                 <w:lang w:val="vi-VN"/>
               </w:rPr>
+              <w:lastRenderedPageBreak/>
               <w:t>Lĩnh vực áp dụng</w:t>
             </w:r>
           </w:p>
@@ -10847,7 +9913,6 @@
                 <w:szCs w:val="26"/>
                 <w:lang w:val="vi-VN"/>
               </w:rPr>
-              <w:lastRenderedPageBreak/>
               <w:t>Thành tố chất lượng</w:t>
             </w:r>
           </w:p>
@@ -11666,6 +10731,7 @@
                 <w:szCs w:val="26"/>
                 <w:lang w:val="vi-VN"/>
               </w:rPr>
+              <w:lastRenderedPageBreak/>
               <w:t>Lĩnh vực áp dụng</w:t>
             </w:r>
           </w:p>
@@ -11788,7 +10854,6 @@
                 <w:szCs w:val="26"/>
                 <w:lang w:val="vi-VN"/>
               </w:rPr>
-              <w:lastRenderedPageBreak/>
               <w:t>Thành tố chất lượng</w:t>
             </w:r>
           </w:p>
@@ -12599,6 +11664,7 @@
                 <w:szCs w:val="26"/>
                 <w:lang w:val="vi-VN"/>
               </w:rPr>
+              <w:lastRenderedPageBreak/>
               <w:t>Thành tố chất lượng</w:t>
             </w:r>
           </w:p>
@@ -12689,49 +11755,38 @@
                 <w:szCs w:val="26"/>
                 <w:lang w:val="vi-VN"/>
               </w:rPr>
-              <w:t xml:space="preserve">Thực hiện kỹ thuật chuyên môn là một chỉ số đánh giá năng lực chuyên môn kỹ thuật của bệnh viện, là căn cứ để đánh giá khả năng đáp ứng nhu </w:t>
-            </w:r>
-            <w:r>
-              <w:rPr>
-                <w:rFonts w:ascii="Times New Roman" w:hAnsi="Times New Roman" w:cs="Times New Roman"/>
-                <w:sz w:val="26"/>
-                <w:szCs w:val="26"/>
-                <w:lang w:val="vi-VN"/>
-              </w:rPr>
-              <w:lastRenderedPageBreak/>
-              <w:t>cầu khám chữa bệnh của người dân trong diện bao phủ và là cơ sở để đầu tư, phát triển bệnh viện.</w:t>
-            </w:r>
-          </w:p>
-        </w:tc>
-      </w:tr>
-      <w:tr>
-        <w:tc>
-          <w:tcPr>
-            <w:tcW w:w="1991" w:type="dxa"/>
-          </w:tcPr>
-          <w:p>
-            <w:pPr>
-              <w:tabs>
-                <w:tab w:val="left" w:pos="567"/>
-              </w:tabs>
-              <w:spacing w:before="60" w:after="60" w:line="276" w:lineRule="auto"/>
-              <w:rPr>
-                <w:rFonts w:ascii="Times New Roman" w:hAnsi="Times New Roman" w:cs="Times New Roman"/>
-                <w:b/>
-                <w:sz w:val="26"/>
-                <w:szCs w:val="26"/>
-                <w:lang w:val="vi-VN"/>
-              </w:rPr>
-            </w:pPr>
-            <w:r>
-              <w:rPr>
-                <w:rFonts w:ascii="Times New Roman" w:hAnsi="Times New Roman" w:cs="Times New Roman"/>
-                <w:b/>
-                <w:sz w:val="26"/>
-                <w:szCs w:val="26"/>
-                <w:lang w:val="vi-VN"/>
-              </w:rPr>
-              <w:lastRenderedPageBreak/>
+              <w:t>Thực hiện kỹ thuật chuyên môn là một chỉ số đánh giá năng lực chuyên môn kỹ thuật của bệnh viện, là căn cứ để đánh giá khả năng đáp ứng nhu cầu khám chữa bệnh của người dân trong diện bao phủ và là cơ sở để đầu tư, phát triển bệnh viện.</w:t>
+            </w:r>
+          </w:p>
+        </w:tc>
+      </w:tr>
+      <w:tr>
+        <w:tc>
+          <w:tcPr>
+            <w:tcW w:w="1991" w:type="dxa"/>
+          </w:tcPr>
+          <w:p>
+            <w:pPr>
+              <w:tabs>
+                <w:tab w:val="left" w:pos="567"/>
+              </w:tabs>
+              <w:spacing w:before="60" w:after="60" w:line="276" w:lineRule="auto"/>
+              <w:rPr>
+                <w:rFonts w:ascii="Times New Roman" w:hAnsi="Times New Roman" w:cs="Times New Roman"/>
+                <w:b/>
+                <w:sz w:val="26"/>
+                <w:szCs w:val="26"/>
+                <w:lang w:val="vi-VN"/>
+              </w:rPr>
+            </w:pPr>
+            <w:r>
+              <w:rPr>
+                <w:rFonts w:ascii="Times New Roman" w:hAnsi="Times New Roman" w:cs="Times New Roman"/>
+                <w:b/>
+                <w:sz w:val="26"/>
+                <w:szCs w:val="26"/>
+                <w:lang w:val="vi-VN"/>
+              </w:rPr>
               <w:t>Phương pháp tính</w:t>
             </w:r>
           </w:p>
@@ -13494,6 +12549,7 @@
                 <w:szCs w:val="26"/>
                 <w:lang w:val="vi-VN"/>
               </w:rPr>
+              <w:lastRenderedPageBreak/>
               <w:t>Phương pháp tính</w:t>
             </w:r>
           </w:p>
@@ -13609,7 +12665,6 @@
                 <w:szCs w:val="26"/>
                 <w:lang w:val="vi-VN"/>
               </w:rPr>
-              <w:lastRenderedPageBreak/>
               <w:t>Mẫu số</w:t>
             </w:r>
           </w:p>
@@ -14555,6 +13610,7 @@
                 <w:szCs w:val="26"/>
                 <w:lang w:val="vi-VN"/>
               </w:rPr>
+              <w:lastRenderedPageBreak/>
               <w:t>Giá trị của số liệu</w:t>
             </w:r>
           </w:p>
@@ -14684,7 +13740,6 @@
           <w:sz w:val="28"/>
           <w:szCs w:val="28"/>
         </w:rPr>
-        <w:lastRenderedPageBreak/>
         <w:t>44</w:t>
       </w:r>
     </w:p>
@@ -15532,6 +14587,7 @@
                 <w:b/>
                 <w:lang w:val="vi-VN"/>
               </w:rPr>
+              <w:lastRenderedPageBreak/>
               <w:t>Lý do lựa chọn</w:t>
             </w:r>
           </w:p>
@@ -15621,7 +14677,6 @@
                 <w:i/>
                 <w:lang w:val="vi-VN"/>
               </w:rPr>
-              <w:lastRenderedPageBreak/>
               <w:t>Tử số</w:t>
             </w:r>
           </w:p>
@@ -16729,6 +15784,7 @@
                 <w:b/>
                 <w:lang w:val="vi-VN"/>
               </w:rPr>
+              <w:lastRenderedPageBreak/>
               <w:t>Lý do lựa chọn</w:t>
             </w:r>
           </w:p>
@@ -16776,7 +15832,6 @@
                 <w:b/>
                 <w:lang w:val="vi-VN"/>
               </w:rPr>
-              <w:lastRenderedPageBreak/>
               <w:t>Phương pháp tính</w:t>
             </w:r>
           </w:p>
@@ -17538,6 +16593,7 @@
                 <w:b/>
                 <w:lang w:val="vi-VN"/>
               </w:rPr>
+              <w:lastRenderedPageBreak/>
               <w:t>Phương pháp tính</w:t>
             </w:r>
           </w:p>
@@ -17592,7 +16648,6 @@
                 <w:b/>
                 <w:lang w:val="vi-VN"/>
               </w:rPr>
-              <w:lastRenderedPageBreak/>
               <w:t>Nguồn số liệu</w:t>
             </w:r>
           </w:p>
@@ -18339,38 +17394,49 @@
                 <w:szCs w:val="26"/>
                 <w:lang w:val="vi-VN"/>
               </w:rPr>
-              <w:t xml:space="preserve">Khoa cấp cứu là nơi thường xuyên tiếp nhận nhiều bệnh nhân, trong khi nguồn lực y tế có giới hạn, số lượng người bệnh thay đổi, gia tăng qua từng năm và nhiều trường hợp bệnh nhân vào khoa cùng một thời điểm. Bên cạnh đó kỹ năng đánh giá , phân loại người bệnh của nhân viên y tế chưa thật sự đồng bộ  </w:t>
-            </w:r>
-          </w:p>
-        </w:tc>
-      </w:tr>
-      <w:tr>
-        <w:tc>
-          <w:tcPr>
-            <w:tcW w:w="1991" w:type="dxa"/>
-          </w:tcPr>
-          <w:p>
-            <w:pPr>
-              <w:tabs>
-                <w:tab w:val="left" w:pos="567"/>
-              </w:tabs>
-              <w:spacing w:before="60" w:after="60" w:line="276" w:lineRule="auto"/>
-              <w:rPr>
-                <w:rFonts w:ascii="Times New Roman" w:hAnsi="Times New Roman" w:cs="Times New Roman"/>
-                <w:b/>
-                <w:sz w:val="26"/>
-                <w:szCs w:val="26"/>
-                <w:lang w:val="vi-VN"/>
-              </w:rPr>
-            </w:pPr>
-            <w:r>
-              <w:rPr>
-                <w:rFonts w:ascii="Times New Roman" w:hAnsi="Times New Roman" w:cs="Times New Roman"/>
-                <w:b/>
-                <w:sz w:val="26"/>
-                <w:szCs w:val="26"/>
-                <w:lang w:val="vi-VN"/>
-              </w:rPr>
+              <w:t xml:space="preserve">Khoa cấp cứu là nơi thường xuyên tiếp nhận nhiều bệnh nhân, trong khi nguồn lực y tế có giới hạn, số lượng người bệnh thay đổi, gia tăng qua từng năm và nhiều trường hợp bệnh nhân vào khoa cùng một thời điểm. </w:t>
+            </w:r>
+            <w:r>
+              <w:rPr>
+                <w:rFonts w:ascii="Times New Roman" w:hAnsi="Times New Roman" w:cs="Times New Roman"/>
+                <w:sz w:val="26"/>
+                <w:szCs w:val="26"/>
+                <w:lang w:val="vi-VN"/>
+              </w:rPr>
+              <w:lastRenderedPageBreak/>
+              <w:t xml:space="preserve">Bên cạnh đó kỹ năng đánh giá , phân loại người bệnh của nhân viên y tế chưa thật sự đồng bộ  </w:t>
+            </w:r>
+          </w:p>
+        </w:tc>
+      </w:tr>
+      <w:tr>
+        <w:tc>
+          <w:tcPr>
+            <w:tcW w:w="1991" w:type="dxa"/>
+          </w:tcPr>
+          <w:p>
+            <w:pPr>
+              <w:tabs>
+                <w:tab w:val="left" w:pos="567"/>
+              </w:tabs>
+              <w:spacing w:before="60" w:after="60" w:line="276" w:lineRule="auto"/>
+              <w:rPr>
+                <w:rFonts w:ascii="Times New Roman" w:hAnsi="Times New Roman" w:cs="Times New Roman"/>
+                <w:b/>
+                <w:sz w:val="26"/>
+                <w:szCs w:val="26"/>
+                <w:lang w:val="vi-VN"/>
+              </w:rPr>
+            </w:pPr>
+            <w:r>
+              <w:rPr>
+                <w:rFonts w:ascii="Times New Roman" w:hAnsi="Times New Roman" w:cs="Times New Roman"/>
+                <w:b/>
+                <w:sz w:val="26"/>
+                <w:szCs w:val="26"/>
+                <w:lang w:val="vi-VN"/>
+              </w:rPr>
+              <w:lastRenderedPageBreak/>
               <w:t>Phương pháp tính</w:t>
             </w:r>
           </w:p>
@@ -18424,7 +17490,6 @@
                 <w:szCs w:val="26"/>
                 <w:lang w:val="vi-VN"/>
               </w:rPr>
-              <w:lastRenderedPageBreak/>
               <w:t>Tử số</w:t>
             </w:r>
           </w:p>
@@ -19177,6 +18242,7 @@
                 <w:szCs w:val="26"/>
                 <w:lang w:val="vi-VN"/>
               </w:rPr>
+              <w:lastRenderedPageBreak/>
               <w:t>Khía cạnh chất lượng</w:t>
             </w:r>
           </w:p>
@@ -19307,7 +18373,6 @@
                 <w:szCs w:val="26"/>
                 <w:lang w:val="vi-VN"/>
               </w:rPr>
-              <w:lastRenderedPageBreak/>
               <w:t>Lý do lựa chọn</w:t>
             </w:r>
           </w:p>
@@ -19975,6 +19040,7 @@
                 <w:szCs w:val="26"/>
                 <w:lang w:val="vi-VN"/>
               </w:rPr>
+              <w:lastRenderedPageBreak/>
               <w:t>Tên chỉ số</w:t>
             </w:r>
           </w:p>
@@ -20107,7 +19173,6 @@
                 <w:szCs w:val="26"/>
                 <w:lang w:val="vi-VN"/>
               </w:rPr>
-              <w:lastRenderedPageBreak/>
               <w:t>Lĩnh vực áp dụng</w:t>
             </w:r>
           </w:p>
@@ -20985,6 +20050,7 @@
                 <w:szCs w:val="26"/>
                 <w:lang w:val="vi-VN"/>
               </w:rPr>
+              <w:lastRenderedPageBreak/>
               <w:t>Định nghĩa chỉ số</w:t>
             </w:r>
           </w:p>
@@ -21050,7 +20116,6 @@
                 <w:szCs w:val="26"/>
                 <w:lang w:val="vi-VN"/>
               </w:rPr>
-              <w:lastRenderedPageBreak/>
               <w:t>Lĩnh vực áp dụng</w:t>
             </w:r>
           </w:p>
@@ -21928,6 +20993,7 @@
                 <w:szCs w:val="26"/>
                 <w:lang w:val="vi-VN"/>
               </w:rPr>
+              <w:lastRenderedPageBreak/>
               <w:t>Định nghĩa chỉ số</w:t>
             </w:r>
           </w:p>
@@ -22060,7 +21126,6 @@
                 <w:szCs w:val="26"/>
                 <w:lang w:val="vi-VN"/>
               </w:rPr>
-              <w:lastRenderedPageBreak/>
               <w:t>Khía cạnh chất lượng</w:t>
             </w:r>
           </w:p>
@@ -22974,6 +22039,7 @@
                 <w:szCs w:val="26"/>
                 <w:lang w:val="vi-VN"/>
               </w:rPr>
+              <w:lastRenderedPageBreak/>
               <w:t>Lĩnh vực áp dụng</w:t>
             </w:r>
           </w:p>
@@ -23104,7 +22170,6 @@
                 <w:szCs w:val="26"/>
                 <w:lang w:val="vi-VN"/>
               </w:rPr>
-              <w:lastRenderedPageBreak/>
               <w:t>Thành tố chất lượng</w:t>
             </w:r>
           </w:p>
@@ -23982,6 +23047,7 @@
                 <w:szCs w:val="26"/>
                 <w:lang w:val="vi-VN"/>
               </w:rPr>
+              <w:lastRenderedPageBreak/>
               <w:t>Khía cạnh chất lượng</w:t>
             </w:r>
           </w:p>
@@ -24112,7 +23178,6 @@
                 <w:szCs w:val="26"/>
                 <w:lang w:val="vi-VN"/>
               </w:rPr>
-              <w:lastRenderedPageBreak/>
               <w:t>Lý do lựa chọn</w:t>
             </w:r>
           </w:p>
@@ -24958,6 +24023,7 @@
                 <w:szCs w:val="26"/>
                 <w:lang w:val="vi-VN"/>
               </w:rPr>
+              <w:lastRenderedPageBreak/>
               <w:t>Khía cạnh chất lượng</w:t>
             </w:r>
           </w:p>
@@ -25085,7 +24151,6 @@
                 <w:szCs w:val="26"/>
                 <w:lang w:val="vi-VN"/>
               </w:rPr>
-              <w:lastRenderedPageBreak/>
               <w:t>Lý do lựa chọn</w:t>
             </w:r>
           </w:p>
@@ -25753,6 +24818,7 @@
                 <w:szCs w:val="26"/>
                 <w:lang w:val="vi-VN"/>
               </w:rPr>
+              <w:lastRenderedPageBreak/>
               <w:t>Tên chỉ số</w:t>
             </w:r>
           </w:p>
@@ -25840,7 +24906,6 @@
                 <w:szCs w:val="26"/>
                 <w:lang w:val="vi-VN"/>
               </w:rPr>
-              <w:lastRenderedPageBreak/>
               <w:t>Định nghĩa chỉ số</w:t>
             </w:r>
           </w:p>
@@ -26716,6 +25781,7 @@
                 <w:szCs w:val="26"/>
                 <w:lang w:val="vi-VN"/>
               </w:rPr>
+              <w:lastRenderedPageBreak/>
               <w:t>Tên chỉ số</w:t>
             </w:r>
           </w:p>
@@ -26783,7 +25849,6 @@
                 <w:szCs w:val="26"/>
                 <w:lang w:val="vi-VN"/>
               </w:rPr>
-              <w:lastRenderedPageBreak/>
               <w:t>Định nghĩa chỉ số</w:t>
             </w:r>
           </w:p>
@@ -27650,15 +26715,7 @@
           <w:sz w:val="28"/>
           <w:szCs w:val="28"/>
         </w:rPr>
-        <w:t xml:space="preserve">Phòng </w:t>
-      </w:r>
-      <w:r>
-        <w:rPr>
-          <w:rFonts w:ascii="Times New Roman" w:hAnsi="Times New Roman" w:cs="Times New Roman"/>
-          <w:sz w:val="28"/>
-          <w:szCs w:val="28"/>
-        </w:rPr>
-        <w:t>Hành chánh</w:t>
+        <w:t>Phòng Hành chánh</w:t>
       </w:r>
     </w:p>
     <w:p>
@@ -27681,6 +26738,7 @@
           <w:sz w:val="28"/>
           <w:szCs w:val="28"/>
         </w:rPr>
+        <w:lastRenderedPageBreak/>
         <w:t>18</w:t>
       </w:r>
     </w:p>
@@ -27722,7 +26780,6 @@
                 <w:szCs w:val="26"/>
                 <w:lang w:val="vi-VN"/>
               </w:rPr>
-              <w:lastRenderedPageBreak/>
               <w:t>Tên chỉ số</w:t>
             </w:r>
           </w:p>
@@ -30084,15 +29141,7 @@
           <w:sz w:val="28"/>
           <w:szCs w:val="28"/>
         </w:rPr>
-        <w:t xml:space="preserve"> </w:t>
-      </w:r>
-      <w:r>
-        <w:rPr>
-          <w:rFonts w:ascii="Times New Roman" w:hAnsi="Times New Roman" w:cs="Times New Roman"/>
-          <w:sz w:val="28"/>
-          <w:szCs w:val="28"/>
-        </w:rPr>
-        <w:t>Khoa Kiểm soát nhiễm khuẩn (KSNK)</w:t>
+        <w:t xml:space="preserve"> Khoa Kiểm soát nhiễm khuẩn (KSNK)</w:t>
       </w:r>
     </w:p>
     <w:p>
@@ -47574,19 +46623,6 @@
         </w:tc>
       </w:tr>
     </w:tbl>
-    <w:p>
-      <w:pPr>
-        <w:spacing w:before="240"/>
-        <w:jc w:val="both"/>
-        <w:rPr>
-          <w:rFonts w:ascii="Times New Roman" w:hAnsi="Times New Roman" w:cs="Times New Roman"/>
-          <w:b/>
-          <w:bCs/>
-          <w:sz w:val="28"/>
-          <w:szCs w:val="28"/>
-        </w:rPr>
-      </w:pPr>
-    </w:p>
     <w:p>
       <w:pPr>
         <w:spacing w:before="240"/>

</xml_diff>

<commit_message>
feat: cập nhật export Excel và phân công chỉ số
</commit_message>
<xml_diff>
--- a/HospitalQualityDashboard/Tai_Lieu/Phân chia các chỉ số dựa theo đơn vị thu thập và tổng hợp.docx
+++ b/HospitalQualityDashboard/Tai_Lieu/Phân chia các chỉ số dựa theo đơn vị thu thập và tổng hợp.docx
@@ -6012,915 +6012,6 @@
           <w:sz w:val="28"/>
           <w:szCs w:val="28"/>
         </w:rPr>
-        <w:t>14.</w:t>
-      </w:r>
-    </w:p>
-    <w:tbl>
-      <w:tblPr>
-        <w:tblStyle w:val="TableGrid"/>
-        <w:tblW w:w="9702" w:type="dxa"/>
-        <w:tblInd w:w="74" w:type="dxa"/>
-        <w:tblLook w:val="04A0" w:firstRow="1" w:lastRow="0" w:firstColumn="1" w:lastColumn="0" w:noHBand="0" w:noVBand="1"/>
-      </w:tblPr>
-      <w:tblGrid>
-        <w:gridCol w:w="1991"/>
-        <w:gridCol w:w="7711"/>
-      </w:tblGrid>
-      <w:tr>
-        <w:tc>
-          <w:tcPr>
-            <w:tcW w:w="1991" w:type="dxa"/>
-          </w:tcPr>
-          <w:p>
-            <w:pPr>
-              <w:tabs>
-                <w:tab w:val="left" w:pos="567"/>
-              </w:tabs>
-              <w:spacing w:before="60" w:after="60" w:line="276" w:lineRule="auto"/>
-              <w:rPr>
-                <w:rFonts w:ascii="Times New Roman" w:hAnsi="Times New Roman" w:cs="Times New Roman"/>
-                <w:b/>
-                <w:sz w:val="28"/>
-                <w:szCs w:val="28"/>
-                <w:lang w:val="vi-VN"/>
-              </w:rPr>
-            </w:pPr>
-            <w:r>
-              <w:rPr>
-                <w:rFonts w:ascii="Times New Roman" w:hAnsi="Times New Roman" w:cs="Times New Roman"/>
-                <w:b/>
-                <w:sz w:val="28"/>
-                <w:szCs w:val="28"/>
-                <w:lang w:val="vi-VN"/>
-              </w:rPr>
-              <w:t>Tên chỉ số</w:t>
-            </w:r>
-          </w:p>
-        </w:tc>
-        <w:tc>
-          <w:tcPr>
-            <w:tcW w:w="7711" w:type="dxa"/>
-          </w:tcPr>
-          <w:p>
-            <w:pPr>
-              <w:tabs>
-                <w:tab w:val="left" w:pos="567"/>
-              </w:tabs>
-              <w:spacing w:before="60" w:after="60"/>
-              <w:jc w:val="both"/>
-              <w:rPr>
-                <w:rFonts w:ascii="Times New Roman" w:hAnsi="Times New Roman" w:cs="Times New Roman"/>
-                <w:b/>
-                <w:sz w:val="28"/>
-                <w:szCs w:val="28"/>
-                <w:lang w:val="vi-VN"/>
-              </w:rPr>
-            </w:pPr>
-            <w:r>
-              <w:rPr>
-                <w:rFonts w:ascii="Times New Roman" w:hAnsi="Times New Roman" w:cs="Times New Roman"/>
-                <w:color w:val="FF0000"/>
-                <w:sz w:val="28"/>
-                <w:szCs w:val="28"/>
-                <w:lang w:val="vi-VN"/>
-              </w:rPr>
-              <w:t>Số lượng người bệnh được truyền thông dinh dưỡng.</w:t>
-            </w:r>
-          </w:p>
-        </w:tc>
-      </w:tr>
-      <w:tr>
-        <w:tc>
-          <w:tcPr>
-            <w:tcW w:w="1991" w:type="dxa"/>
-          </w:tcPr>
-          <w:p>
-            <w:pPr>
-              <w:tabs>
-                <w:tab w:val="left" w:pos="567"/>
-              </w:tabs>
-              <w:spacing w:before="60" w:after="60" w:line="276" w:lineRule="auto"/>
-              <w:rPr>
-                <w:rFonts w:ascii="Times New Roman" w:hAnsi="Times New Roman" w:cs="Times New Roman"/>
-                <w:b/>
-                <w:sz w:val="28"/>
-                <w:szCs w:val="28"/>
-                <w:lang w:val="vi-VN"/>
-              </w:rPr>
-            </w:pPr>
-            <w:r>
-              <w:rPr>
-                <w:rFonts w:ascii="Times New Roman" w:hAnsi="Times New Roman" w:cs="Times New Roman"/>
-                <w:b/>
-                <w:sz w:val="28"/>
-                <w:szCs w:val="28"/>
-                <w:lang w:val="vi-VN"/>
-              </w:rPr>
-              <w:t>Định nghĩa chỉ số</w:t>
-            </w:r>
-          </w:p>
-        </w:tc>
-        <w:tc>
-          <w:tcPr>
-            <w:tcW w:w="7711" w:type="dxa"/>
-          </w:tcPr>
-          <w:p>
-            <w:pPr>
-              <w:tabs>
-                <w:tab w:val="left" w:pos="567"/>
-              </w:tabs>
-              <w:spacing w:before="60" w:after="60"/>
-              <w:jc w:val="both"/>
-              <w:rPr>
-                <w:rFonts w:ascii="Times New Roman" w:hAnsi="Times New Roman" w:cs="Times New Roman"/>
-                <w:sz w:val="28"/>
-                <w:szCs w:val="28"/>
-                <w:lang w:val="vi-VN"/>
-              </w:rPr>
-            </w:pPr>
-            <w:r>
-              <w:rPr>
-                <w:rFonts w:ascii="Times New Roman" w:hAnsi="Times New Roman" w:cs="Times New Roman"/>
-                <w:sz w:val="28"/>
-                <w:szCs w:val="28"/>
-                <w:lang w:val="vi-VN"/>
-              </w:rPr>
-              <w:t>Là công cụ để đo lường chất lượng về mặt cung cấp kiến thức dinh dưỡng cho người bệnh khi vào viên.</w:t>
-            </w:r>
-          </w:p>
-        </w:tc>
-      </w:tr>
-      <w:tr>
-        <w:tc>
-          <w:tcPr>
-            <w:tcW w:w="1991" w:type="dxa"/>
-          </w:tcPr>
-          <w:p>
-            <w:pPr>
-              <w:tabs>
-                <w:tab w:val="left" w:pos="567"/>
-              </w:tabs>
-              <w:spacing w:before="60" w:after="60" w:line="276" w:lineRule="auto"/>
-              <w:rPr>
-                <w:rFonts w:ascii="Times New Roman" w:hAnsi="Times New Roman" w:cs="Times New Roman"/>
-                <w:b/>
-                <w:sz w:val="28"/>
-                <w:szCs w:val="28"/>
-                <w:lang w:val="vi-VN"/>
-              </w:rPr>
-            </w:pPr>
-            <w:r>
-              <w:rPr>
-                <w:rFonts w:ascii="Times New Roman" w:hAnsi="Times New Roman" w:cs="Times New Roman"/>
-                <w:b/>
-                <w:sz w:val="28"/>
-                <w:szCs w:val="28"/>
-                <w:lang w:val="vi-VN"/>
-              </w:rPr>
-              <w:t>Lĩnh vực áp dụng</w:t>
-            </w:r>
-          </w:p>
-        </w:tc>
-        <w:tc>
-          <w:tcPr>
-            <w:tcW w:w="7711" w:type="dxa"/>
-          </w:tcPr>
-          <w:p>
-            <w:pPr>
-              <w:tabs>
-                <w:tab w:val="left" w:pos="567"/>
-              </w:tabs>
-              <w:spacing w:before="60" w:after="60"/>
-              <w:jc w:val="both"/>
-              <w:rPr>
-                <w:rFonts w:ascii="Times New Roman" w:hAnsi="Times New Roman" w:cs="Times New Roman"/>
-                <w:sz w:val="28"/>
-                <w:szCs w:val="28"/>
-                <w:lang w:val="vi-VN"/>
-              </w:rPr>
-            </w:pPr>
-            <w:r>
-              <w:rPr>
-                <w:rFonts w:ascii="Times New Roman" w:hAnsi="Times New Roman" w:cs="Times New Roman"/>
-                <w:sz w:val="28"/>
-                <w:szCs w:val="28"/>
-                <w:lang w:val="vi-VN"/>
-              </w:rPr>
-              <w:t>Cung cấp kiến thức và truyền thông dinh dưỡng.</w:t>
-            </w:r>
-          </w:p>
-        </w:tc>
-      </w:tr>
-      <w:tr>
-        <w:tc>
-          <w:tcPr>
-            <w:tcW w:w="1991" w:type="dxa"/>
-          </w:tcPr>
-          <w:p>
-            <w:pPr>
-              <w:tabs>
-                <w:tab w:val="left" w:pos="567"/>
-              </w:tabs>
-              <w:spacing w:before="60" w:after="60" w:line="276" w:lineRule="auto"/>
-              <w:rPr>
-                <w:rFonts w:ascii="Times New Roman" w:hAnsi="Times New Roman" w:cs="Times New Roman"/>
-                <w:b/>
-                <w:sz w:val="28"/>
-                <w:szCs w:val="28"/>
-                <w:lang w:val="vi-VN"/>
-              </w:rPr>
-            </w:pPr>
-            <w:r>
-              <w:rPr>
-                <w:rFonts w:ascii="Times New Roman" w:hAnsi="Times New Roman" w:cs="Times New Roman"/>
-                <w:b/>
-                <w:sz w:val="28"/>
-                <w:szCs w:val="28"/>
-                <w:lang w:val="vi-VN"/>
-              </w:rPr>
-              <w:t>Khía cạnh chất lượng</w:t>
-            </w:r>
-          </w:p>
-        </w:tc>
-        <w:tc>
-          <w:tcPr>
-            <w:tcW w:w="7711" w:type="dxa"/>
-          </w:tcPr>
-          <w:p>
-            <w:pPr>
-              <w:tabs>
-                <w:tab w:val="left" w:pos="567"/>
-              </w:tabs>
-              <w:spacing w:before="60" w:after="60"/>
-              <w:jc w:val="both"/>
-              <w:rPr>
-                <w:rFonts w:ascii="Times New Roman" w:hAnsi="Times New Roman" w:cs="Times New Roman"/>
-                <w:sz w:val="28"/>
-                <w:szCs w:val="28"/>
-                <w:lang w:val="vi-VN"/>
-              </w:rPr>
-            </w:pPr>
-            <w:r>
-              <w:rPr>
-                <w:rFonts w:ascii="Times New Roman" w:hAnsi="Times New Roman" w:cs="Times New Roman"/>
-                <w:sz w:val="28"/>
-                <w:szCs w:val="28"/>
-                <w:lang w:val="vi-VN"/>
-              </w:rPr>
-              <w:t>Thay đổi hành vi dinh dưỡng của người bệnh.</w:t>
-            </w:r>
-          </w:p>
-        </w:tc>
-      </w:tr>
-      <w:tr>
-        <w:tc>
-          <w:tcPr>
-            <w:tcW w:w="1991" w:type="dxa"/>
-          </w:tcPr>
-          <w:p>
-            <w:pPr>
-              <w:tabs>
-                <w:tab w:val="left" w:pos="567"/>
-              </w:tabs>
-              <w:spacing w:before="60" w:after="60" w:line="276" w:lineRule="auto"/>
-              <w:rPr>
-                <w:rFonts w:ascii="Times New Roman" w:hAnsi="Times New Roman" w:cs="Times New Roman"/>
-                <w:b/>
-                <w:sz w:val="28"/>
-                <w:szCs w:val="28"/>
-                <w:lang w:val="vi-VN"/>
-              </w:rPr>
-            </w:pPr>
-            <w:r>
-              <w:rPr>
-                <w:rFonts w:ascii="Times New Roman" w:hAnsi="Times New Roman" w:cs="Times New Roman"/>
-                <w:b/>
-                <w:sz w:val="28"/>
-                <w:szCs w:val="28"/>
-                <w:lang w:val="vi-VN"/>
-              </w:rPr>
-              <w:t>Thành tố chất lượng</w:t>
-            </w:r>
-          </w:p>
-        </w:tc>
-        <w:tc>
-          <w:tcPr>
-            <w:tcW w:w="7711" w:type="dxa"/>
-          </w:tcPr>
-          <w:p>
-            <w:pPr>
-              <w:pStyle w:val="ListParagraph"/>
-              <w:ind w:left="360"/>
-              <w:jc w:val="both"/>
-              <w:rPr>
-                <w:rFonts w:ascii="Times New Roman" w:hAnsi="Times New Roman" w:cs="Times New Roman"/>
-                <w:i/>
-                <w:color w:val="FF0000"/>
-                <w:sz w:val="28"/>
-                <w:szCs w:val="28"/>
-                <w:u w:val="single"/>
-                <w:lang w:val="vi-VN"/>
-              </w:rPr>
-            </w:pPr>
-            <w:r>
-              <w:rPr>
-                <w:rFonts w:ascii="Times New Roman" w:hAnsi="Times New Roman" w:cs="Times New Roman"/>
-                <w:sz w:val="28"/>
-                <w:szCs w:val="28"/>
-                <w:u w:val="single"/>
-                <w:lang w:val="vi-VN"/>
-              </w:rPr>
-              <w:t>Đầu ra</w:t>
-            </w:r>
-            <w:r>
-              <w:rPr>
-                <w:rFonts w:ascii="Times New Roman" w:hAnsi="Times New Roman" w:cs="Times New Roman"/>
-                <w:i/>
-                <w:color w:val="FF0000"/>
-                <w:sz w:val="28"/>
-                <w:szCs w:val="28"/>
-                <w:u w:val="single"/>
-                <w:lang w:val="vi-VN"/>
-              </w:rPr>
-              <w:t xml:space="preserve"> </w:t>
-            </w:r>
-          </w:p>
-        </w:tc>
-      </w:tr>
-      <w:tr>
-        <w:tc>
-          <w:tcPr>
-            <w:tcW w:w="1991" w:type="dxa"/>
-          </w:tcPr>
-          <w:p>
-            <w:pPr>
-              <w:tabs>
-                <w:tab w:val="left" w:pos="567"/>
-              </w:tabs>
-              <w:spacing w:before="60" w:after="60" w:line="276" w:lineRule="auto"/>
-              <w:rPr>
-                <w:rFonts w:ascii="Times New Roman" w:hAnsi="Times New Roman" w:cs="Times New Roman"/>
-                <w:b/>
-                <w:sz w:val="28"/>
-                <w:szCs w:val="28"/>
-                <w:lang w:val="vi-VN"/>
-              </w:rPr>
-            </w:pPr>
-            <w:r>
-              <w:rPr>
-                <w:rFonts w:ascii="Times New Roman" w:hAnsi="Times New Roman" w:cs="Times New Roman"/>
-                <w:b/>
-                <w:sz w:val="28"/>
-                <w:szCs w:val="28"/>
-                <w:lang w:val="vi-VN"/>
-              </w:rPr>
-              <w:t>Lý do lựa chọn</w:t>
-            </w:r>
-          </w:p>
-        </w:tc>
-        <w:tc>
-          <w:tcPr>
-            <w:tcW w:w="7711" w:type="dxa"/>
-          </w:tcPr>
-          <w:p>
-            <w:pPr>
-              <w:tabs>
-                <w:tab w:val="left" w:pos="567"/>
-              </w:tabs>
-              <w:spacing w:before="60" w:after="60"/>
-              <w:rPr>
-                <w:rFonts w:ascii="Times New Roman" w:hAnsi="Times New Roman" w:cs="Times New Roman"/>
-                <w:sz w:val="28"/>
-                <w:szCs w:val="28"/>
-                <w:lang w:val="vi-VN"/>
-              </w:rPr>
-            </w:pPr>
-            <w:r>
-              <w:rPr>
-                <w:rFonts w:ascii="Times New Roman" w:hAnsi="Times New Roman" w:cs="Times New Roman"/>
-                <w:sz w:val="28"/>
-                <w:szCs w:val="28"/>
-                <w:lang w:val="vi-VN"/>
-              </w:rPr>
-              <w:t>Lý do lựa chọn: mong muốn cải thiên tình trạng dinh dưỡng cho người bệnh ung thư, cải thiện chất lượng cuộc sống cho người bệnh.</w:t>
-            </w:r>
-          </w:p>
-        </w:tc>
-      </w:tr>
-      <w:tr>
-        <w:tc>
-          <w:tcPr>
-            <w:tcW w:w="1991" w:type="dxa"/>
-          </w:tcPr>
-          <w:p>
-            <w:pPr>
-              <w:tabs>
-                <w:tab w:val="left" w:pos="567"/>
-              </w:tabs>
-              <w:spacing w:before="60" w:after="60" w:line="276" w:lineRule="auto"/>
-              <w:rPr>
-                <w:rFonts w:ascii="Times New Roman" w:hAnsi="Times New Roman" w:cs="Times New Roman"/>
-                <w:b/>
-                <w:sz w:val="28"/>
-                <w:szCs w:val="28"/>
-                <w:lang w:val="vi-VN"/>
-              </w:rPr>
-            </w:pPr>
-            <w:r>
-              <w:rPr>
-                <w:rFonts w:ascii="Times New Roman" w:hAnsi="Times New Roman" w:cs="Times New Roman"/>
-                <w:b/>
-                <w:sz w:val="28"/>
-                <w:szCs w:val="28"/>
-                <w:lang w:val="vi-VN"/>
-              </w:rPr>
-              <w:lastRenderedPageBreak/>
-              <w:t>Phương pháp tính</w:t>
-            </w:r>
-          </w:p>
-        </w:tc>
-        <w:tc>
-          <w:tcPr>
-            <w:tcW w:w="7711" w:type="dxa"/>
-          </w:tcPr>
-          <w:p>
-            <w:pPr>
-              <w:pStyle w:val="ListParagraph"/>
-              <w:tabs>
-                <w:tab w:val="left" w:pos="567"/>
-              </w:tabs>
-              <w:spacing w:before="60" w:after="60"/>
-              <w:ind w:left="360"/>
-              <w:jc w:val="both"/>
-              <w:rPr>
-                <w:rFonts w:ascii="Times New Roman" w:hAnsi="Times New Roman" w:cs="Times New Roman"/>
-                <w:sz w:val="28"/>
-                <w:szCs w:val="28"/>
-                <w:lang w:val="vi-VN"/>
-              </w:rPr>
-            </w:pPr>
-            <w:r>
-              <w:rPr>
-                <w:rFonts w:ascii="Times New Roman" w:hAnsi="Times New Roman" w:cs="Times New Roman"/>
-                <w:sz w:val="28"/>
-                <w:szCs w:val="28"/>
-                <w:lang w:val="vi-VN"/>
-              </w:rPr>
-              <w:t xml:space="preserve"> </w:t>
-            </w:r>
-          </w:p>
-        </w:tc>
-      </w:tr>
-      <w:tr>
-        <w:tc>
-          <w:tcPr>
-            <w:tcW w:w="1991" w:type="dxa"/>
-          </w:tcPr>
-          <w:p>
-            <w:pPr>
-              <w:tabs>
-                <w:tab w:val="left" w:pos="567"/>
-              </w:tabs>
-              <w:spacing w:before="60" w:after="60" w:line="276" w:lineRule="auto"/>
-              <w:jc w:val="right"/>
-              <w:rPr>
-                <w:rFonts w:ascii="Times New Roman" w:hAnsi="Times New Roman" w:cs="Times New Roman"/>
-                <w:i/>
-                <w:sz w:val="28"/>
-                <w:szCs w:val="28"/>
-                <w:lang w:val="vi-VN"/>
-              </w:rPr>
-            </w:pPr>
-            <w:r>
-              <w:rPr>
-                <w:rFonts w:ascii="Times New Roman" w:hAnsi="Times New Roman" w:cs="Times New Roman"/>
-                <w:i/>
-                <w:sz w:val="28"/>
-                <w:szCs w:val="28"/>
-                <w:lang w:val="vi-VN"/>
-              </w:rPr>
-              <w:t>Tử số</w:t>
-            </w:r>
-          </w:p>
-        </w:tc>
-        <w:tc>
-          <w:tcPr>
-            <w:tcW w:w="7711" w:type="dxa"/>
-          </w:tcPr>
-          <w:p>
-            <w:pPr>
-              <w:tabs>
-                <w:tab w:val="left" w:pos="567"/>
-              </w:tabs>
-              <w:spacing w:before="60" w:after="60"/>
-              <w:jc w:val="both"/>
-              <w:rPr>
-                <w:rFonts w:ascii="Times New Roman" w:hAnsi="Times New Roman" w:cs="Times New Roman"/>
-                <w:sz w:val="28"/>
-                <w:szCs w:val="28"/>
-                <w:lang w:val="vi-VN"/>
-              </w:rPr>
-            </w:pPr>
-            <w:r>
-              <w:rPr>
-                <w:rFonts w:ascii="Times New Roman" w:hAnsi="Times New Roman" w:cs="Times New Roman"/>
-                <w:sz w:val="28"/>
-                <w:szCs w:val="28"/>
-                <w:lang w:val="vi-VN"/>
-              </w:rPr>
-              <w:t>Số lần truyền thông X (Số lượng người bệnh+ người nhà được truyền thông dinh dưỡng/ 1 lần truyền thông).</w:t>
-            </w:r>
-          </w:p>
-        </w:tc>
-      </w:tr>
-      <w:tr>
-        <w:tc>
-          <w:tcPr>
-            <w:tcW w:w="1991" w:type="dxa"/>
-          </w:tcPr>
-          <w:p>
-            <w:pPr>
-              <w:tabs>
-                <w:tab w:val="left" w:pos="567"/>
-              </w:tabs>
-              <w:spacing w:before="60" w:after="60" w:line="276" w:lineRule="auto"/>
-              <w:jc w:val="right"/>
-              <w:rPr>
-                <w:rFonts w:ascii="Times New Roman" w:hAnsi="Times New Roman" w:cs="Times New Roman"/>
-                <w:i/>
-                <w:sz w:val="28"/>
-                <w:szCs w:val="28"/>
-                <w:lang w:val="vi-VN"/>
-              </w:rPr>
-            </w:pPr>
-            <w:r>
-              <w:rPr>
-                <w:rFonts w:ascii="Times New Roman" w:hAnsi="Times New Roman" w:cs="Times New Roman"/>
-                <w:i/>
-                <w:sz w:val="28"/>
-                <w:szCs w:val="28"/>
-                <w:lang w:val="vi-VN"/>
-              </w:rPr>
-              <w:t>Mẫu số</w:t>
-            </w:r>
-          </w:p>
-        </w:tc>
-        <w:tc>
-          <w:tcPr>
-            <w:tcW w:w="7711" w:type="dxa"/>
-          </w:tcPr>
-          <w:p>
-            <w:pPr>
-              <w:tabs>
-                <w:tab w:val="left" w:pos="567"/>
-              </w:tabs>
-              <w:spacing w:before="60" w:after="60"/>
-              <w:jc w:val="both"/>
-              <w:rPr>
-                <w:rFonts w:ascii="Times New Roman" w:hAnsi="Times New Roman" w:cs="Times New Roman"/>
-                <w:sz w:val="28"/>
-                <w:szCs w:val="28"/>
-                <w:lang w:val="vi-VN"/>
-              </w:rPr>
-            </w:pPr>
-            <w:r>
-              <w:rPr>
-                <w:rFonts w:ascii="Times New Roman" w:hAnsi="Times New Roman" w:cs="Times New Roman"/>
-                <w:sz w:val="28"/>
-                <w:szCs w:val="28"/>
-                <w:lang w:val="vi-VN"/>
-              </w:rPr>
-              <w:t>Số lượng bệnh nhân nhập viện (không tính phòng khám) X 2 lần.</w:t>
-            </w:r>
-          </w:p>
-        </w:tc>
-      </w:tr>
-      <w:tr>
-        <w:tc>
-          <w:tcPr>
-            <w:tcW w:w="1991" w:type="dxa"/>
-          </w:tcPr>
-          <w:p>
-            <w:pPr>
-              <w:tabs>
-                <w:tab w:val="left" w:pos="567"/>
-              </w:tabs>
-              <w:spacing w:before="60" w:after="60" w:line="276" w:lineRule="auto"/>
-              <w:rPr>
-                <w:rFonts w:ascii="Times New Roman" w:hAnsi="Times New Roman" w:cs="Times New Roman"/>
-                <w:b/>
-                <w:sz w:val="28"/>
-                <w:szCs w:val="28"/>
-                <w:lang w:val="vi-VN"/>
-              </w:rPr>
-            </w:pPr>
-            <w:r>
-              <w:rPr>
-                <w:rFonts w:ascii="Times New Roman" w:hAnsi="Times New Roman" w:cs="Times New Roman"/>
-                <w:b/>
-                <w:sz w:val="28"/>
-                <w:szCs w:val="28"/>
-                <w:lang w:val="vi-VN"/>
-              </w:rPr>
-              <w:t>Nguồn số liệu</w:t>
-            </w:r>
-          </w:p>
-        </w:tc>
-        <w:tc>
-          <w:tcPr>
-            <w:tcW w:w="7711" w:type="dxa"/>
-          </w:tcPr>
-          <w:p>
-            <w:pPr>
-              <w:tabs>
-                <w:tab w:val="left" w:pos="567"/>
-              </w:tabs>
-              <w:spacing w:before="60" w:after="60"/>
-              <w:jc w:val="both"/>
-              <w:rPr>
-                <w:rFonts w:ascii="Times New Roman" w:hAnsi="Times New Roman" w:cs="Times New Roman"/>
-                <w:sz w:val="28"/>
-                <w:szCs w:val="28"/>
-                <w:lang w:val="vi-VN"/>
-              </w:rPr>
-            </w:pPr>
-            <w:r>
-              <w:rPr>
-                <w:rFonts w:ascii="Times New Roman" w:hAnsi="Times New Roman" w:cs="Times New Roman"/>
-                <w:sz w:val="28"/>
-                <w:szCs w:val="28"/>
-                <w:lang w:val="vi-VN"/>
-              </w:rPr>
-              <w:t>Người bệnh hoặc người nhà bệnh nhân.</w:t>
-            </w:r>
-          </w:p>
-        </w:tc>
-      </w:tr>
-      <w:tr>
-        <w:tc>
-          <w:tcPr>
-            <w:tcW w:w="1991" w:type="dxa"/>
-          </w:tcPr>
-          <w:p>
-            <w:pPr>
-              <w:tabs>
-                <w:tab w:val="left" w:pos="567"/>
-              </w:tabs>
-              <w:spacing w:before="60" w:after="60" w:line="276" w:lineRule="auto"/>
-              <w:rPr>
-                <w:rFonts w:ascii="Times New Roman" w:hAnsi="Times New Roman" w:cs="Times New Roman"/>
-                <w:b/>
-                <w:sz w:val="28"/>
-                <w:szCs w:val="28"/>
-                <w:lang w:val="vi-VN"/>
-              </w:rPr>
-            </w:pPr>
-            <w:r>
-              <w:rPr>
-                <w:rFonts w:ascii="Times New Roman" w:hAnsi="Times New Roman" w:cs="Times New Roman"/>
-                <w:b/>
-                <w:sz w:val="28"/>
-                <w:szCs w:val="28"/>
-                <w:lang w:val="vi-VN"/>
-              </w:rPr>
-              <w:t>Thu thập và tổng hợp số liệu</w:t>
-            </w:r>
-          </w:p>
-        </w:tc>
-        <w:tc>
-          <w:tcPr>
-            <w:tcW w:w="7711" w:type="dxa"/>
-          </w:tcPr>
-          <w:p>
-            <w:pPr>
-              <w:tabs>
-                <w:tab w:val="left" w:pos="567"/>
-              </w:tabs>
-              <w:spacing w:before="60" w:after="60"/>
-              <w:jc w:val="both"/>
-              <w:rPr>
-                <w:rFonts w:ascii="Times New Roman" w:hAnsi="Times New Roman" w:cs="Times New Roman"/>
-                <w:sz w:val="28"/>
-                <w:szCs w:val="28"/>
-                <w:lang w:val="vi-VN"/>
-              </w:rPr>
-            </w:pPr>
-            <w:r>
-              <w:rPr>
-                <w:rFonts w:ascii="Times New Roman" w:hAnsi="Times New Roman" w:cs="Times New Roman"/>
-                <w:sz w:val="28"/>
-                <w:szCs w:val="28"/>
-                <w:lang w:val="vi-VN"/>
-              </w:rPr>
-              <w:t>Hiện nay, bệnh viện đang thu thập và tổng hợp số liệu số lượng người bệnh được truyền thông dinh dưỡng khi vào viện.</w:t>
-            </w:r>
-          </w:p>
-        </w:tc>
-      </w:tr>
-      <w:tr>
-        <w:tc>
-          <w:tcPr>
-            <w:tcW w:w="1991" w:type="dxa"/>
-          </w:tcPr>
-          <w:p>
-            <w:pPr>
-              <w:tabs>
-                <w:tab w:val="left" w:pos="567"/>
-              </w:tabs>
-              <w:spacing w:before="60" w:after="60" w:line="276" w:lineRule="auto"/>
-              <w:rPr>
-                <w:rFonts w:ascii="Times New Roman" w:hAnsi="Times New Roman" w:cs="Times New Roman"/>
-                <w:b/>
-                <w:sz w:val="28"/>
-                <w:szCs w:val="28"/>
-                <w:lang w:val="vi-VN"/>
-              </w:rPr>
-            </w:pPr>
-            <w:r>
-              <w:rPr>
-                <w:rFonts w:ascii="Times New Roman" w:hAnsi="Times New Roman" w:cs="Times New Roman"/>
-                <w:b/>
-                <w:sz w:val="28"/>
-                <w:szCs w:val="28"/>
-                <w:lang w:val="vi-VN"/>
-              </w:rPr>
-              <w:t>Giá trị của số liệu</w:t>
-            </w:r>
-          </w:p>
-        </w:tc>
-        <w:tc>
-          <w:tcPr>
-            <w:tcW w:w="7711" w:type="dxa"/>
-          </w:tcPr>
-          <w:p>
-            <w:pPr>
-              <w:tabs>
-                <w:tab w:val="left" w:pos="567"/>
-              </w:tabs>
-              <w:spacing w:before="60" w:after="60"/>
-              <w:jc w:val="both"/>
-              <w:rPr>
-                <w:rFonts w:ascii="Times New Roman" w:hAnsi="Times New Roman" w:cs="Times New Roman"/>
-                <w:sz w:val="28"/>
-                <w:szCs w:val="28"/>
-                <w:lang w:val="vi-VN"/>
-              </w:rPr>
-            </w:pPr>
-            <w:r>
-              <w:rPr>
-                <w:rFonts w:ascii="Times New Roman" w:hAnsi="Times New Roman" w:cs="Times New Roman"/>
-                <w:sz w:val="28"/>
-                <w:szCs w:val="28"/>
-                <w:lang w:val="vi-VN"/>
-              </w:rPr>
-              <w:t>Độ chính xác cao vì lấy số liệu thực tế.</w:t>
-            </w:r>
-          </w:p>
-        </w:tc>
-      </w:tr>
-      <w:tr>
-        <w:tc>
-          <w:tcPr>
-            <w:tcW w:w="1991" w:type="dxa"/>
-          </w:tcPr>
-          <w:p>
-            <w:pPr>
-              <w:tabs>
-                <w:tab w:val="left" w:pos="567"/>
-              </w:tabs>
-              <w:spacing w:before="60" w:after="60" w:line="276" w:lineRule="auto"/>
-              <w:rPr>
-                <w:rFonts w:ascii="Times New Roman" w:hAnsi="Times New Roman" w:cs="Times New Roman"/>
-                <w:b/>
-                <w:sz w:val="28"/>
-                <w:szCs w:val="28"/>
-                <w:lang w:val="vi-VN"/>
-              </w:rPr>
-            </w:pPr>
-            <w:r>
-              <w:rPr>
-                <w:rFonts w:ascii="Times New Roman" w:hAnsi="Times New Roman" w:cs="Times New Roman"/>
-                <w:b/>
-                <w:sz w:val="28"/>
-                <w:szCs w:val="28"/>
-                <w:lang w:val="vi-VN"/>
-              </w:rPr>
-              <w:t>Tần suất báo cáo</w:t>
-            </w:r>
-          </w:p>
-        </w:tc>
-        <w:tc>
-          <w:tcPr>
-            <w:tcW w:w="7711" w:type="dxa"/>
-          </w:tcPr>
-          <w:p>
-            <w:pPr>
-              <w:tabs>
-                <w:tab w:val="left" w:pos="567"/>
-              </w:tabs>
-              <w:spacing w:before="60" w:after="60"/>
-              <w:jc w:val="both"/>
-              <w:rPr>
-                <w:rFonts w:ascii="Times New Roman" w:hAnsi="Times New Roman" w:cs="Times New Roman"/>
-                <w:sz w:val="28"/>
-                <w:szCs w:val="28"/>
-                <w:lang w:val="vi-VN"/>
-              </w:rPr>
-            </w:pPr>
-            <w:r>
-              <w:rPr>
-                <w:rFonts w:ascii="Times New Roman" w:hAnsi="Times New Roman" w:cs="Times New Roman"/>
-                <w:sz w:val="28"/>
-                <w:szCs w:val="28"/>
-                <w:lang w:val="vi-VN"/>
-              </w:rPr>
-              <w:t>6 lần truyền thông (tại bệnh nhân, tại khoa).</w:t>
-            </w:r>
-          </w:p>
-        </w:tc>
-      </w:tr>
-      <w:tr>
-        <w:tc>
-          <w:tcPr>
-            <w:tcW w:w="1991" w:type="dxa"/>
-          </w:tcPr>
-          <w:p>
-            <w:pPr>
-              <w:tabs>
-                <w:tab w:val="left" w:pos="567"/>
-              </w:tabs>
-              <w:spacing w:before="60" w:after="60" w:line="276" w:lineRule="auto"/>
-              <w:rPr>
-                <w:rFonts w:ascii="Times New Roman" w:hAnsi="Times New Roman" w:cs="Times New Roman"/>
-                <w:b/>
-                <w:sz w:val="28"/>
-                <w:szCs w:val="28"/>
-                <w:lang w:val="vi-VN"/>
-              </w:rPr>
-            </w:pPr>
-            <w:r>
-              <w:rPr>
-                <w:rFonts w:ascii="Times New Roman" w:hAnsi="Times New Roman" w:cs="Times New Roman"/>
-                <w:b/>
-                <w:sz w:val="28"/>
-                <w:szCs w:val="28"/>
-                <w:lang w:val="vi-VN"/>
-              </w:rPr>
-              <w:t>Mục tiêu đạt được trong năm 2020</w:t>
-            </w:r>
-          </w:p>
-        </w:tc>
-        <w:tc>
-          <w:tcPr>
-            <w:tcW w:w="7711" w:type="dxa"/>
-          </w:tcPr>
-          <w:p>
-            <w:pPr>
-              <w:tabs>
-                <w:tab w:val="left" w:pos="567"/>
-              </w:tabs>
-              <w:spacing w:before="60" w:after="60"/>
-              <w:jc w:val="both"/>
-              <w:rPr>
-                <w:rFonts w:ascii="Times New Roman" w:hAnsi="Times New Roman" w:cs="Times New Roman"/>
-                <w:sz w:val="28"/>
-                <w:szCs w:val="28"/>
-                <w:lang w:val="vi-VN"/>
-              </w:rPr>
-            </w:pPr>
-            <w:r>
-              <w:rPr>
-                <w:rFonts w:ascii="Times New Roman" w:hAnsi="Times New Roman" w:cs="Times New Roman"/>
-                <w:sz w:val="28"/>
-                <w:szCs w:val="28"/>
-                <w:lang w:val="vi-VN"/>
-              </w:rPr>
-              <w:t>Đạt &gt; 50 % , 6 lần tổ chức/năm.</w:t>
-            </w:r>
-          </w:p>
-        </w:tc>
-      </w:tr>
-    </w:tbl>
-    <w:p>
-      <w:pPr>
-        <w:spacing w:before="240"/>
-        <w:jc w:val="both"/>
-        <w:rPr>
-          <w:rFonts w:ascii="Times New Roman" w:hAnsi="Times New Roman" w:cs="Times New Roman"/>
-          <w:b/>
-          <w:bCs/>
-          <w:sz w:val="28"/>
-          <w:szCs w:val="28"/>
-        </w:rPr>
-      </w:pPr>
-      <w:r>
-        <w:rPr>
-          <w:rFonts w:ascii="Times New Roman" w:hAnsi="Times New Roman" w:cs="Times New Roman"/>
-          <w:b/>
-          <w:bCs/>
-          <w:sz w:val="28"/>
-          <w:szCs w:val="28"/>
-        </w:rPr>
         <w:t>17.</w:t>
       </w:r>
     </w:p>
@@ -7311,17 +6402,7 @@
                 <w:szCs w:val="26"/>
                 <w:lang w:val="vi-VN"/>
               </w:rPr>
-              <w:t xml:space="preserve">Lý do lựa chọn: mong muốn cải thiện tình trạng dinh dưỡng cho người bệnh ung thư, cải thiện chất lượng cuộc sống cho người bệnh, cũng như </w:t>
-            </w:r>
-            <w:r>
-              <w:rPr>
-                <w:rFonts w:ascii="Times New Roman" w:hAnsi="Times New Roman" w:cs="Times New Roman"/>
-                <w:sz w:val="26"/>
-                <w:szCs w:val="26"/>
-                <w:lang w:val="vi-VN"/>
-              </w:rPr>
-              <w:lastRenderedPageBreak/>
-              <w:t>tăng cường kiến thức cho nhân viên y tế trong đánh giá, truyền thông dinh dưỡng cho người bệnh.</w:t>
+              <w:t>Lý do lựa chọn: mong muốn cải thiện tình trạng dinh dưỡng cho người bệnh ung thư, cải thiện chất lượng cuộc sống cho người bệnh, cũng như tăng cường kiến thức cho nhân viên y tế trong đánh giá, truyền thông dinh dưỡng cho người bệnh.</w:t>
             </w:r>
           </w:p>
         </w:tc>
@@ -8136,7 +7217,6 @@
                 <w:szCs w:val="26"/>
                 <w:lang w:val="vi-VN"/>
               </w:rPr>
-              <w:lastRenderedPageBreak/>
               <w:t>Báo cáo phản ứng có hại trực tuyến thông qua trang web</w:t>
             </w:r>
           </w:p>
@@ -8962,69 +8042,79 @@
                 <w:szCs w:val="26"/>
                 <w:lang w:val="vi-VN"/>
               </w:rPr>
+              <w:t>Lý do lựa chọn</w:t>
+            </w:r>
+          </w:p>
+        </w:tc>
+        <w:tc>
+          <w:tcPr>
+            <w:tcW w:w="7711" w:type="dxa"/>
+          </w:tcPr>
+          <w:p>
+            <w:pPr>
+              <w:tabs>
+                <w:tab w:val="left" w:pos="567"/>
+              </w:tabs>
+              <w:spacing w:before="60" w:after="60" w:line="276" w:lineRule="auto"/>
+              <w:jc w:val="both"/>
+              <w:rPr>
+                <w:rFonts w:ascii="Times New Roman" w:hAnsi="Times New Roman" w:cs="Times New Roman"/>
+                <w:sz w:val="26"/>
+                <w:szCs w:val="26"/>
+                <w:lang w:val="vi-VN"/>
+              </w:rPr>
+            </w:pPr>
+            <w:r>
+              <w:rPr>
+                <w:rFonts w:ascii="Times New Roman" w:hAnsi="Times New Roman" w:cs="Times New Roman"/>
+                <w:sz w:val="26"/>
+                <w:szCs w:val="26"/>
+                <w:lang w:val="vi-VN"/>
+              </w:rPr>
+              <w:tab/>
+              <w:t xml:space="preserve">Cải tiến chất lượng khám chữa bệnh vừa là mục tiêu vừa là nhiệm vụ trọng tâm và xuyên suốt, được tiến hành liên tục nhằm đáp ứng nhu </w:t>
+            </w:r>
+            <w:r>
+              <w:rPr>
+                <w:rFonts w:ascii="Times New Roman" w:hAnsi="Times New Roman" w:cs="Times New Roman"/>
+                <w:sz w:val="26"/>
+                <w:szCs w:val="26"/>
+                <w:lang w:val="vi-VN"/>
+              </w:rPr>
               <w:lastRenderedPageBreak/>
-              <w:t>Lý do lựa chọn</w:t>
-            </w:r>
-          </w:p>
-        </w:tc>
-        <w:tc>
-          <w:tcPr>
-            <w:tcW w:w="7711" w:type="dxa"/>
-          </w:tcPr>
-          <w:p>
-            <w:pPr>
-              <w:tabs>
-                <w:tab w:val="left" w:pos="567"/>
-              </w:tabs>
-              <w:spacing w:before="60" w:after="60" w:line="276" w:lineRule="auto"/>
-              <w:jc w:val="both"/>
-              <w:rPr>
-                <w:rFonts w:ascii="Times New Roman" w:hAnsi="Times New Roman" w:cs="Times New Roman"/>
-                <w:sz w:val="26"/>
-                <w:szCs w:val="26"/>
-                <w:lang w:val="vi-VN"/>
-              </w:rPr>
-            </w:pPr>
-            <w:r>
-              <w:rPr>
-                <w:rFonts w:ascii="Times New Roman" w:hAnsi="Times New Roman" w:cs="Times New Roman"/>
-                <w:sz w:val="26"/>
-                <w:szCs w:val="26"/>
-                <w:lang w:val="vi-VN"/>
-              </w:rPr>
-              <w:tab/>
-              <w:t>Cải tiến chất lượng khám chữa bệnh vừa là mục tiêu vừa là nhiệm vụ trọng tâm và xuyên suốt, được tiến hành liên tục nhằm đáp ứng nhu cầu phục vụ an toàn, chu đáo, hiệu quả và đáp ứng kì vọng của người bệnh. Đây là vấn đề cấp bách cần xem xét, nghiên cứu, đánh giá một cách nghiêm túc và khoa học để tìm ra những giải pháp phù hợp nhằm cải thiện và nâng cao sự tín nhiệm và hài lòng của người dân đối với bệnh viện.</w:t>
-            </w:r>
-          </w:p>
-        </w:tc>
-      </w:tr>
-      <w:tr>
-        <w:tc>
-          <w:tcPr>
-            <w:tcW w:w="1991" w:type="dxa"/>
-          </w:tcPr>
-          <w:p>
-            <w:pPr>
-              <w:tabs>
-                <w:tab w:val="left" w:pos="567"/>
-              </w:tabs>
-              <w:spacing w:before="60" w:after="60" w:line="276" w:lineRule="auto"/>
-              <w:rPr>
-                <w:rFonts w:ascii="Times New Roman" w:hAnsi="Times New Roman" w:cs="Times New Roman"/>
-                <w:b/>
-                <w:sz w:val="26"/>
-                <w:szCs w:val="26"/>
-                <w:lang w:val="vi-VN"/>
-              </w:rPr>
-            </w:pPr>
-            <w:r>
-              <w:rPr>
-                <w:rFonts w:ascii="Times New Roman" w:hAnsi="Times New Roman" w:cs="Times New Roman"/>
-                <w:b/>
-                <w:sz w:val="26"/>
-                <w:szCs w:val="26"/>
-                <w:lang w:val="vi-VN"/>
-              </w:rPr>
+              <w:t>cầu phục vụ an toàn, chu đáo, hiệu quả và đáp ứng kì vọng của người bệnh. Đây là vấn đề cấp bách cần xem xét, nghiên cứu, đánh giá một cách nghiêm túc và khoa học để tìm ra những giải pháp phù hợp nhằm cải thiện và nâng cao sự tín nhiệm và hài lòng của người dân đối với bệnh viện.</w:t>
+            </w:r>
+          </w:p>
+        </w:tc>
+      </w:tr>
+      <w:tr>
+        <w:tc>
+          <w:tcPr>
+            <w:tcW w:w="1991" w:type="dxa"/>
+          </w:tcPr>
+          <w:p>
+            <w:pPr>
+              <w:tabs>
+                <w:tab w:val="left" w:pos="567"/>
+              </w:tabs>
+              <w:spacing w:before="60" w:after="60" w:line="276" w:lineRule="auto"/>
+              <w:rPr>
+                <w:rFonts w:ascii="Times New Roman" w:hAnsi="Times New Roman" w:cs="Times New Roman"/>
+                <w:b/>
+                <w:sz w:val="26"/>
+                <w:szCs w:val="26"/>
+                <w:lang w:val="vi-VN"/>
+              </w:rPr>
+            </w:pPr>
+            <w:r>
+              <w:rPr>
+                <w:rFonts w:ascii="Times New Roman" w:hAnsi="Times New Roman" w:cs="Times New Roman"/>
+                <w:b/>
+                <w:sz w:val="26"/>
+                <w:szCs w:val="26"/>
+                <w:lang w:val="vi-VN"/>
+              </w:rPr>
+              <w:lastRenderedPageBreak/>
               <w:t>Phương pháp tính</w:t>
             </w:r>
           </w:p>
@@ -9790,68 +8880,68 @@
                 <w:szCs w:val="26"/>
                 <w:lang w:val="vi-VN"/>
               </w:rPr>
+              <w:t>Lĩnh vực áp dụng</w:t>
+            </w:r>
+          </w:p>
+        </w:tc>
+        <w:tc>
+          <w:tcPr>
+            <w:tcW w:w="7711" w:type="dxa"/>
+          </w:tcPr>
+          <w:p>
+            <w:pPr>
+              <w:tabs>
+                <w:tab w:val="left" w:pos="567"/>
+              </w:tabs>
+              <w:spacing w:before="60" w:after="60" w:line="276" w:lineRule="auto"/>
+              <w:jc w:val="both"/>
+              <w:rPr>
+                <w:rFonts w:ascii="Times New Roman" w:hAnsi="Times New Roman" w:cs="Times New Roman"/>
+                <w:sz w:val="26"/>
+                <w:szCs w:val="26"/>
+                <w:lang w:val="vi-VN"/>
+              </w:rPr>
+            </w:pPr>
+            <w:r>
+              <w:rPr>
+                <w:rFonts w:ascii="Times New Roman" w:hAnsi="Times New Roman" w:cs="Times New Roman"/>
+                <w:sz w:val="26"/>
+                <w:szCs w:val="26"/>
+                <w:lang w:val="vi-VN"/>
+              </w:rPr>
+              <w:t>Khoa Khám bệnh</w:t>
+            </w:r>
+          </w:p>
+        </w:tc>
+      </w:tr>
+      <w:tr>
+        <w:tc>
+          <w:tcPr>
+            <w:tcW w:w="1991" w:type="dxa"/>
+          </w:tcPr>
+          <w:p>
+            <w:pPr>
+              <w:tabs>
+                <w:tab w:val="left" w:pos="567"/>
+              </w:tabs>
+              <w:spacing w:before="60" w:after="60" w:line="276" w:lineRule="auto"/>
+              <w:rPr>
+                <w:rFonts w:ascii="Times New Roman" w:hAnsi="Times New Roman" w:cs="Times New Roman"/>
+                <w:b/>
+                <w:sz w:val="26"/>
+                <w:szCs w:val="26"/>
+                <w:lang w:val="vi-VN"/>
+              </w:rPr>
+            </w:pPr>
+            <w:r>
+              <w:rPr>
+                <w:rFonts w:ascii="Times New Roman" w:hAnsi="Times New Roman" w:cs="Times New Roman"/>
+                <w:b/>
+                <w:sz w:val="26"/>
+                <w:szCs w:val="26"/>
+                <w:lang w:val="vi-VN"/>
+              </w:rPr>
               <w:lastRenderedPageBreak/>
-              <w:t>Lĩnh vực áp dụng</w:t>
-            </w:r>
-          </w:p>
-        </w:tc>
-        <w:tc>
-          <w:tcPr>
-            <w:tcW w:w="7711" w:type="dxa"/>
-          </w:tcPr>
-          <w:p>
-            <w:pPr>
-              <w:tabs>
-                <w:tab w:val="left" w:pos="567"/>
-              </w:tabs>
-              <w:spacing w:before="60" w:after="60" w:line="276" w:lineRule="auto"/>
-              <w:jc w:val="both"/>
-              <w:rPr>
-                <w:rFonts w:ascii="Times New Roman" w:hAnsi="Times New Roman" w:cs="Times New Roman"/>
-                <w:sz w:val="26"/>
-                <w:szCs w:val="26"/>
-                <w:lang w:val="vi-VN"/>
-              </w:rPr>
-            </w:pPr>
-            <w:r>
-              <w:rPr>
-                <w:rFonts w:ascii="Times New Roman" w:hAnsi="Times New Roman" w:cs="Times New Roman"/>
-                <w:sz w:val="26"/>
-                <w:szCs w:val="26"/>
-                <w:lang w:val="vi-VN"/>
-              </w:rPr>
-              <w:t>Khoa Khám bệnh</w:t>
-            </w:r>
-          </w:p>
-        </w:tc>
-      </w:tr>
-      <w:tr>
-        <w:tc>
-          <w:tcPr>
-            <w:tcW w:w="1991" w:type="dxa"/>
-          </w:tcPr>
-          <w:p>
-            <w:pPr>
-              <w:tabs>
-                <w:tab w:val="left" w:pos="567"/>
-              </w:tabs>
-              <w:spacing w:before="60" w:after="60" w:line="276" w:lineRule="auto"/>
-              <w:rPr>
-                <w:rFonts w:ascii="Times New Roman" w:hAnsi="Times New Roman" w:cs="Times New Roman"/>
-                <w:b/>
-                <w:sz w:val="26"/>
-                <w:szCs w:val="26"/>
-                <w:lang w:val="vi-VN"/>
-              </w:rPr>
-            </w:pPr>
-            <w:r>
-              <w:rPr>
-                <w:rFonts w:ascii="Times New Roman" w:hAnsi="Times New Roman" w:cs="Times New Roman"/>
-                <w:b/>
-                <w:sz w:val="26"/>
-                <w:szCs w:val="26"/>
-                <w:lang w:val="vi-VN"/>
-              </w:rPr>
               <w:t>Khía cạnh chất lượng</w:t>
             </w:r>
           </w:p>
@@ -10731,68 +9821,68 @@
                 <w:szCs w:val="26"/>
                 <w:lang w:val="vi-VN"/>
               </w:rPr>
+              <w:t>Lĩnh vực áp dụng</w:t>
+            </w:r>
+          </w:p>
+        </w:tc>
+        <w:tc>
+          <w:tcPr>
+            <w:tcW w:w="7711" w:type="dxa"/>
+          </w:tcPr>
+          <w:p>
+            <w:pPr>
+              <w:tabs>
+                <w:tab w:val="left" w:pos="567"/>
+              </w:tabs>
+              <w:spacing w:before="120"/>
+              <w:jc w:val="both"/>
+              <w:rPr>
+                <w:rFonts w:ascii="Times New Roman" w:hAnsi="Times New Roman" w:cs="Times New Roman"/>
+                <w:sz w:val="26"/>
+                <w:szCs w:val="26"/>
+                <w:lang w:val="vi-VN"/>
+              </w:rPr>
+            </w:pPr>
+            <w:r>
+              <w:rPr>
+                <w:rFonts w:ascii="Times New Roman" w:hAnsi="Times New Roman" w:cs="Times New Roman"/>
+                <w:sz w:val="26"/>
+                <w:szCs w:val="26"/>
+                <w:lang w:val="vi-VN"/>
+              </w:rPr>
+              <w:t>Ngoại khoa</w:t>
+            </w:r>
+          </w:p>
+        </w:tc>
+      </w:tr>
+      <w:tr>
+        <w:tc>
+          <w:tcPr>
+            <w:tcW w:w="1991" w:type="dxa"/>
+          </w:tcPr>
+          <w:p>
+            <w:pPr>
+              <w:tabs>
+                <w:tab w:val="left" w:pos="567"/>
+              </w:tabs>
+              <w:spacing w:before="120"/>
+              <w:rPr>
+                <w:rFonts w:ascii="Times New Roman" w:hAnsi="Times New Roman" w:cs="Times New Roman"/>
+                <w:b/>
+                <w:sz w:val="26"/>
+                <w:szCs w:val="26"/>
+                <w:lang w:val="vi-VN"/>
+              </w:rPr>
+            </w:pPr>
+            <w:r>
+              <w:rPr>
+                <w:rFonts w:ascii="Times New Roman" w:hAnsi="Times New Roman" w:cs="Times New Roman"/>
+                <w:b/>
+                <w:sz w:val="26"/>
+                <w:szCs w:val="26"/>
+                <w:lang w:val="vi-VN"/>
+              </w:rPr>
               <w:lastRenderedPageBreak/>
-              <w:t>Lĩnh vực áp dụng</w:t>
-            </w:r>
-          </w:p>
-        </w:tc>
-        <w:tc>
-          <w:tcPr>
-            <w:tcW w:w="7711" w:type="dxa"/>
-          </w:tcPr>
-          <w:p>
-            <w:pPr>
-              <w:tabs>
-                <w:tab w:val="left" w:pos="567"/>
-              </w:tabs>
-              <w:spacing w:before="120"/>
-              <w:jc w:val="both"/>
-              <w:rPr>
-                <w:rFonts w:ascii="Times New Roman" w:hAnsi="Times New Roman" w:cs="Times New Roman"/>
-                <w:sz w:val="26"/>
-                <w:szCs w:val="26"/>
-                <w:lang w:val="vi-VN"/>
-              </w:rPr>
-            </w:pPr>
-            <w:r>
-              <w:rPr>
-                <w:rFonts w:ascii="Times New Roman" w:hAnsi="Times New Roman" w:cs="Times New Roman"/>
-                <w:sz w:val="26"/>
-                <w:szCs w:val="26"/>
-                <w:lang w:val="vi-VN"/>
-              </w:rPr>
-              <w:t>Ngoại khoa</w:t>
-            </w:r>
-          </w:p>
-        </w:tc>
-      </w:tr>
-      <w:tr>
-        <w:tc>
-          <w:tcPr>
-            <w:tcW w:w="1991" w:type="dxa"/>
-          </w:tcPr>
-          <w:p>
-            <w:pPr>
-              <w:tabs>
-                <w:tab w:val="left" w:pos="567"/>
-              </w:tabs>
-              <w:spacing w:before="120"/>
-              <w:rPr>
-                <w:rFonts w:ascii="Times New Roman" w:hAnsi="Times New Roman" w:cs="Times New Roman"/>
-                <w:b/>
-                <w:sz w:val="26"/>
-                <w:szCs w:val="26"/>
-                <w:lang w:val="vi-VN"/>
-              </w:rPr>
-            </w:pPr>
-            <w:r>
-              <w:rPr>
-                <w:rFonts w:ascii="Times New Roman" w:hAnsi="Times New Roman" w:cs="Times New Roman"/>
-                <w:b/>
-                <w:sz w:val="26"/>
-                <w:szCs w:val="26"/>
-                <w:lang w:val="vi-VN"/>
-              </w:rPr>
               <w:t>Khía cạnh chất lượng</w:t>
             </w:r>
           </w:p>
@@ -11664,68 +10754,68 @@
                 <w:szCs w:val="26"/>
                 <w:lang w:val="vi-VN"/>
               </w:rPr>
+              <w:t>Thành tố chất lượng</w:t>
+            </w:r>
+          </w:p>
+        </w:tc>
+        <w:tc>
+          <w:tcPr>
+            <w:tcW w:w="7711" w:type="dxa"/>
+          </w:tcPr>
+          <w:p>
+            <w:pPr>
+              <w:tabs>
+                <w:tab w:val="left" w:pos="567"/>
+              </w:tabs>
+              <w:spacing w:before="60" w:after="60" w:line="276" w:lineRule="auto"/>
+              <w:jc w:val="both"/>
+              <w:rPr>
+                <w:rFonts w:ascii="Times New Roman" w:hAnsi="Times New Roman" w:cs="Times New Roman"/>
+                <w:sz w:val="26"/>
+                <w:szCs w:val="26"/>
+                <w:lang w:val="vi-VN"/>
+              </w:rPr>
+            </w:pPr>
+            <w:r>
+              <w:rPr>
+                <w:rFonts w:ascii="Times New Roman" w:hAnsi="Times New Roman" w:cs="Times New Roman"/>
+                <w:sz w:val="26"/>
+                <w:szCs w:val="26"/>
+                <w:lang w:val="vi-VN"/>
+              </w:rPr>
+              <w:t>Quá trình</w:t>
+            </w:r>
+          </w:p>
+        </w:tc>
+      </w:tr>
+      <w:tr>
+        <w:tc>
+          <w:tcPr>
+            <w:tcW w:w="1991" w:type="dxa"/>
+          </w:tcPr>
+          <w:p>
+            <w:pPr>
+              <w:tabs>
+                <w:tab w:val="left" w:pos="567"/>
+              </w:tabs>
+              <w:spacing w:before="60" w:after="60" w:line="276" w:lineRule="auto"/>
+              <w:rPr>
+                <w:rFonts w:ascii="Times New Roman" w:hAnsi="Times New Roman" w:cs="Times New Roman"/>
+                <w:b/>
+                <w:sz w:val="26"/>
+                <w:szCs w:val="26"/>
+                <w:lang w:val="vi-VN"/>
+              </w:rPr>
+            </w:pPr>
+            <w:r>
+              <w:rPr>
+                <w:rFonts w:ascii="Times New Roman" w:hAnsi="Times New Roman" w:cs="Times New Roman"/>
+                <w:b/>
+                <w:sz w:val="26"/>
+                <w:szCs w:val="26"/>
+                <w:lang w:val="vi-VN"/>
+              </w:rPr>
               <w:lastRenderedPageBreak/>
-              <w:t>Thành tố chất lượng</w:t>
-            </w:r>
-          </w:p>
-        </w:tc>
-        <w:tc>
-          <w:tcPr>
-            <w:tcW w:w="7711" w:type="dxa"/>
-          </w:tcPr>
-          <w:p>
-            <w:pPr>
-              <w:tabs>
-                <w:tab w:val="left" w:pos="567"/>
-              </w:tabs>
-              <w:spacing w:before="60" w:after="60" w:line="276" w:lineRule="auto"/>
-              <w:jc w:val="both"/>
-              <w:rPr>
-                <w:rFonts w:ascii="Times New Roman" w:hAnsi="Times New Roman" w:cs="Times New Roman"/>
-                <w:sz w:val="26"/>
-                <w:szCs w:val="26"/>
-                <w:lang w:val="vi-VN"/>
-              </w:rPr>
-            </w:pPr>
-            <w:r>
-              <w:rPr>
-                <w:rFonts w:ascii="Times New Roman" w:hAnsi="Times New Roman" w:cs="Times New Roman"/>
-                <w:sz w:val="26"/>
-                <w:szCs w:val="26"/>
-                <w:lang w:val="vi-VN"/>
-              </w:rPr>
-              <w:t>Quá trình</w:t>
-            </w:r>
-          </w:p>
-        </w:tc>
-      </w:tr>
-      <w:tr>
-        <w:tc>
-          <w:tcPr>
-            <w:tcW w:w="1991" w:type="dxa"/>
-          </w:tcPr>
-          <w:p>
-            <w:pPr>
-              <w:tabs>
-                <w:tab w:val="left" w:pos="567"/>
-              </w:tabs>
-              <w:spacing w:before="60" w:after="60" w:line="276" w:lineRule="auto"/>
-              <w:rPr>
-                <w:rFonts w:ascii="Times New Roman" w:hAnsi="Times New Roman" w:cs="Times New Roman"/>
-                <w:b/>
-                <w:sz w:val="26"/>
-                <w:szCs w:val="26"/>
-                <w:lang w:val="vi-VN"/>
-              </w:rPr>
-            </w:pPr>
-            <w:r>
-              <w:rPr>
-                <w:rFonts w:ascii="Times New Roman" w:hAnsi="Times New Roman" w:cs="Times New Roman"/>
-                <w:b/>
-                <w:sz w:val="26"/>
-                <w:szCs w:val="26"/>
-                <w:lang w:val="vi-VN"/>
-              </w:rPr>
               <w:t>Lý do lựa chọn</w:t>
             </w:r>
           </w:p>
@@ -12549,60 +11639,60 @@
                 <w:szCs w:val="26"/>
                 <w:lang w:val="vi-VN"/>
               </w:rPr>
+              <w:t>Phương pháp tính</w:t>
+            </w:r>
+          </w:p>
+        </w:tc>
+        <w:tc>
+          <w:tcPr>
+            <w:tcW w:w="7711" w:type="dxa"/>
+          </w:tcPr>
+          <w:p>
+            <w:pPr>
+              <w:tabs>
+                <w:tab w:val="left" w:pos="567"/>
+              </w:tabs>
+              <w:spacing w:before="60" w:after="60" w:line="276" w:lineRule="auto"/>
+              <w:jc w:val="both"/>
+              <w:rPr>
+                <w:rFonts w:ascii="Times New Roman" w:hAnsi="Times New Roman" w:cs="Times New Roman"/>
+                <w:sz w:val="26"/>
+                <w:szCs w:val="26"/>
+                <w:lang w:val="vi-VN"/>
+              </w:rPr>
+            </w:pPr>
+          </w:p>
+        </w:tc>
+      </w:tr>
+      <w:tr>
+        <w:tc>
+          <w:tcPr>
+            <w:tcW w:w="1991" w:type="dxa"/>
+          </w:tcPr>
+          <w:p>
+            <w:pPr>
+              <w:tabs>
+                <w:tab w:val="left" w:pos="567"/>
+              </w:tabs>
+              <w:spacing w:before="60" w:after="60" w:line="276" w:lineRule="auto"/>
+              <w:jc w:val="right"/>
+              <w:rPr>
+                <w:rFonts w:ascii="Times New Roman" w:hAnsi="Times New Roman" w:cs="Times New Roman"/>
+                <w:i/>
+                <w:sz w:val="26"/>
+                <w:szCs w:val="26"/>
+                <w:lang w:val="vi-VN"/>
+              </w:rPr>
+            </w:pPr>
+            <w:r>
+              <w:rPr>
+                <w:rFonts w:ascii="Times New Roman" w:hAnsi="Times New Roman" w:cs="Times New Roman"/>
+                <w:i/>
+                <w:sz w:val="26"/>
+                <w:szCs w:val="26"/>
+                <w:lang w:val="vi-VN"/>
+              </w:rPr>
               <w:lastRenderedPageBreak/>
-              <w:t>Phương pháp tính</w:t>
-            </w:r>
-          </w:p>
-        </w:tc>
-        <w:tc>
-          <w:tcPr>
-            <w:tcW w:w="7711" w:type="dxa"/>
-          </w:tcPr>
-          <w:p>
-            <w:pPr>
-              <w:tabs>
-                <w:tab w:val="left" w:pos="567"/>
-              </w:tabs>
-              <w:spacing w:before="60" w:after="60" w:line="276" w:lineRule="auto"/>
-              <w:jc w:val="both"/>
-              <w:rPr>
-                <w:rFonts w:ascii="Times New Roman" w:hAnsi="Times New Roman" w:cs="Times New Roman"/>
-                <w:sz w:val="26"/>
-                <w:szCs w:val="26"/>
-                <w:lang w:val="vi-VN"/>
-              </w:rPr>
-            </w:pPr>
-          </w:p>
-        </w:tc>
-      </w:tr>
-      <w:tr>
-        <w:tc>
-          <w:tcPr>
-            <w:tcW w:w="1991" w:type="dxa"/>
-          </w:tcPr>
-          <w:p>
-            <w:pPr>
-              <w:tabs>
-                <w:tab w:val="left" w:pos="567"/>
-              </w:tabs>
-              <w:spacing w:before="60" w:after="60" w:line="276" w:lineRule="auto"/>
-              <w:jc w:val="right"/>
-              <w:rPr>
-                <w:rFonts w:ascii="Times New Roman" w:hAnsi="Times New Roman" w:cs="Times New Roman"/>
-                <w:i/>
-                <w:sz w:val="26"/>
-                <w:szCs w:val="26"/>
-                <w:lang w:val="vi-VN"/>
-              </w:rPr>
-            </w:pPr>
-            <w:r>
-              <w:rPr>
-                <w:rFonts w:ascii="Times New Roman" w:hAnsi="Times New Roman" w:cs="Times New Roman"/>
-                <w:i/>
-                <w:sz w:val="26"/>
-                <w:szCs w:val="26"/>
-                <w:lang w:val="vi-VN"/>
-              </w:rPr>
               <w:t>Tử số</w:t>
             </w:r>
           </w:p>
@@ -13610,7 +12700,6 @@
                 <w:szCs w:val="26"/>
                 <w:lang w:val="vi-VN"/>
               </w:rPr>
-              <w:lastRenderedPageBreak/>
               <w:t>Giá trị của số liệu</w:t>
             </w:r>
           </w:p>
@@ -14587,54 +13676,54 @@
                 <w:b/>
                 <w:lang w:val="vi-VN"/>
               </w:rPr>
+              <w:t>Lý do lựa chọn</w:t>
+            </w:r>
+          </w:p>
+        </w:tc>
+        <w:tc>
+          <w:tcPr>
+            <w:tcW w:w="7711" w:type="dxa"/>
+          </w:tcPr>
+          <w:p>
+            <w:pPr>
+              <w:tabs>
+                <w:tab w:val="left" w:pos="567"/>
+              </w:tabs>
+              <w:jc w:val="both"/>
+              <w:rPr>
+                <w:lang w:val="vi-VN"/>
+              </w:rPr>
+            </w:pPr>
+            <w:r>
+              <w:rPr>
+                <w:lang w:val="vi-VN"/>
+              </w:rPr>
+              <w:t>Phòng mổ là bộ phận có chi phí đầu tư và vận hành cao trong bệnh viện. Tổ chức phòng mổ không hợp lý dẫn đến quá tải và kéo dài thời gian chờ mổ của bệnh viện. Đo lường và cải thiện hiệu suất sử dụng phòng mổ giúp giảm tải trong bệnh viện và sử dụng tối ưu nguồn lực hiện có.</w:t>
+            </w:r>
+          </w:p>
+        </w:tc>
+      </w:tr>
+      <w:tr>
+        <w:tc>
+          <w:tcPr>
+            <w:tcW w:w="1991" w:type="dxa"/>
+          </w:tcPr>
+          <w:p>
+            <w:pPr>
+              <w:tabs>
+                <w:tab w:val="left" w:pos="567"/>
+              </w:tabs>
+              <w:rPr>
+                <w:b/>
+                <w:lang w:val="vi-VN"/>
+              </w:rPr>
+            </w:pPr>
+            <w:r>
+              <w:rPr>
+                <w:b/>
+                <w:lang w:val="vi-VN"/>
+              </w:rPr>
               <w:lastRenderedPageBreak/>
-              <w:t>Lý do lựa chọn</w:t>
-            </w:r>
-          </w:p>
-        </w:tc>
-        <w:tc>
-          <w:tcPr>
-            <w:tcW w:w="7711" w:type="dxa"/>
-          </w:tcPr>
-          <w:p>
-            <w:pPr>
-              <w:tabs>
-                <w:tab w:val="left" w:pos="567"/>
-              </w:tabs>
-              <w:jc w:val="both"/>
-              <w:rPr>
-                <w:lang w:val="vi-VN"/>
-              </w:rPr>
-            </w:pPr>
-            <w:r>
-              <w:rPr>
-                <w:lang w:val="vi-VN"/>
-              </w:rPr>
-              <w:t>Phòng mổ là bộ phận có chi phí đầu tư và vận hành cao trong bệnh viện. Tổ chức phòng mổ không hợp lý dẫn đến quá tải và kéo dài thời gian chờ mổ của bệnh viện. Đo lường và cải thiện hiệu suất sử dụng phòng mổ giúp giảm tải trong bệnh viện và sử dụng tối ưu nguồn lực hiện có.</w:t>
-            </w:r>
-          </w:p>
-        </w:tc>
-      </w:tr>
-      <w:tr>
-        <w:tc>
-          <w:tcPr>
-            <w:tcW w:w="1991" w:type="dxa"/>
-          </w:tcPr>
-          <w:p>
-            <w:pPr>
-              <w:tabs>
-                <w:tab w:val="left" w:pos="567"/>
-              </w:tabs>
-              <w:rPr>
-                <w:b/>
-                <w:lang w:val="vi-VN"/>
-              </w:rPr>
-            </w:pPr>
-            <w:r>
-              <w:rPr>
-                <w:b/>
-                <w:lang w:val="vi-VN"/>
-              </w:rPr>
               <w:t>Phương pháp tính</w:t>
             </w:r>
           </w:p>
@@ -15784,54 +14873,61 @@
                 <w:b/>
                 <w:lang w:val="vi-VN"/>
               </w:rPr>
+              <w:t>Lý do lựa chọn</w:t>
+            </w:r>
+          </w:p>
+        </w:tc>
+        <w:tc>
+          <w:tcPr>
+            <w:tcW w:w="7711" w:type="dxa"/>
+          </w:tcPr>
+          <w:p>
+            <w:pPr>
+              <w:tabs>
+                <w:tab w:val="left" w:pos="567"/>
+              </w:tabs>
+              <w:jc w:val="both"/>
+              <w:rPr>
+                <w:lang w:val="vi-VN"/>
+              </w:rPr>
+            </w:pPr>
+            <w:r>
+              <w:rPr>
+                <w:lang w:val="vi-VN"/>
+              </w:rPr>
+              <w:t xml:space="preserve">Bệnh viện Ung Bướu là bệnh viện tuyến cuối chuyên điều trị các bệnh về bướu, ung thư. Tuy nhiên, bệnh nhân không chỉ điều trị một bệnh mà còn cần điều trị các bệnh khác. Tỉ lệ chuyển sang bệnh viện khác khám chữa bệnh đo lường </w:t>
+            </w:r>
+            <w:r>
+              <w:rPr>
+                <w:lang w:val="vi-VN"/>
+              </w:rPr>
               <w:lastRenderedPageBreak/>
-              <w:t>Lý do lựa chọn</w:t>
-            </w:r>
-          </w:p>
-        </w:tc>
-        <w:tc>
-          <w:tcPr>
-            <w:tcW w:w="7711" w:type="dxa"/>
-          </w:tcPr>
-          <w:p>
-            <w:pPr>
-              <w:tabs>
-                <w:tab w:val="left" w:pos="567"/>
-              </w:tabs>
-              <w:jc w:val="both"/>
-              <w:rPr>
-                <w:lang w:val="vi-VN"/>
-              </w:rPr>
-            </w:pPr>
-            <w:r>
-              <w:rPr>
-                <w:lang w:val="vi-VN"/>
-              </w:rPr>
-              <w:t>Bệnh viện Ung Bướu là bệnh viện tuyến cuối chuyên điều trị các bệnh về bướu, ung thư. Tuy nhiên, bệnh nhân không chỉ điều trị một bệnh mà còn cần điều trị các bệnh khác. Tỉ lệ chuyển sang bệnh viện khác khám chữa bệnh đo lường mức độ bệnh nhân chuyển sang bệnh viện khác, từ đó nâng cao năng lực diều trị.</w:t>
-            </w:r>
-          </w:p>
-        </w:tc>
-      </w:tr>
-      <w:tr>
-        <w:tc>
-          <w:tcPr>
-            <w:tcW w:w="1991" w:type="dxa"/>
-          </w:tcPr>
-          <w:p>
-            <w:pPr>
-              <w:tabs>
-                <w:tab w:val="left" w:pos="567"/>
-              </w:tabs>
-              <w:rPr>
-                <w:b/>
-                <w:lang w:val="vi-VN"/>
-              </w:rPr>
-            </w:pPr>
-            <w:r>
-              <w:rPr>
-                <w:b/>
-                <w:lang w:val="vi-VN"/>
-              </w:rPr>
+              <w:t>mức độ bệnh nhân chuyển sang bệnh viện khác, từ đó nâng cao năng lực diều trị.</w:t>
+            </w:r>
+          </w:p>
+        </w:tc>
+      </w:tr>
+      <w:tr>
+        <w:tc>
+          <w:tcPr>
+            <w:tcW w:w="1991" w:type="dxa"/>
+          </w:tcPr>
+          <w:p>
+            <w:pPr>
+              <w:tabs>
+                <w:tab w:val="left" w:pos="567"/>
+              </w:tabs>
+              <w:rPr>
+                <w:b/>
+                <w:lang w:val="vi-VN"/>
+              </w:rPr>
+            </w:pPr>
+            <w:r>
+              <w:rPr>
+                <w:b/>
+                <w:lang w:val="vi-VN"/>
+              </w:rPr>
+              <w:lastRenderedPageBreak/>
               <w:t>Phương pháp tính</w:t>
             </w:r>
           </w:p>
@@ -16593,61 +15689,69 @@
                 <w:b/>
                 <w:lang w:val="vi-VN"/>
               </w:rPr>
+              <w:t>Phương pháp tính</w:t>
+            </w:r>
+          </w:p>
+        </w:tc>
+        <w:tc>
+          <w:tcPr>
+            <w:tcW w:w="7711" w:type="dxa"/>
+          </w:tcPr>
+          <w:p>
+            <w:pPr>
+              <w:jc w:val="both"/>
+              <w:rPr>
+                <w:szCs w:val="26"/>
+                <w:lang w:val="vi-VN"/>
+              </w:rPr>
+            </w:pPr>
+            <w:r>
+              <w:rPr>
+                <w:b/>
+                <w:szCs w:val="26"/>
+                <w:lang w:val="vi-VN"/>
+              </w:rPr>
+              <w:t xml:space="preserve">Tổng số lượt khám bệnh: </w:t>
+            </w:r>
+            <w:r>
+              <w:rPr>
+                <w:szCs w:val="26"/>
+                <w:lang w:val="vi-VN"/>
+              </w:rPr>
+              <w:t xml:space="preserve">Khoa Khám bệnh, Cấp cứu, Khoa TSUT, Phòng khám ngoài giờ, Số lượt khám ngoại trú khoa LS, TPNT - khoa Khám bệnh, TPNT - ngoài giờ, CSGN tại nhà, Khám ngoài giờ khoa Xạ 3, Nội 4, khám Tim mạch, </w:t>
+            </w:r>
+            <w:r>
+              <w:rPr>
+                <w:szCs w:val="26"/>
+                <w:lang w:val="vi-VN"/>
+              </w:rPr>
               <w:lastRenderedPageBreak/>
-              <w:t>Phương pháp tính</w:t>
-            </w:r>
-          </w:p>
-        </w:tc>
-        <w:tc>
-          <w:tcPr>
-            <w:tcW w:w="7711" w:type="dxa"/>
-          </w:tcPr>
-          <w:p>
-            <w:pPr>
-              <w:jc w:val="both"/>
-              <w:rPr>
-                <w:szCs w:val="26"/>
-                <w:lang w:val="vi-VN"/>
-              </w:rPr>
-            </w:pPr>
-            <w:r>
-              <w:rPr>
-                <w:b/>
-                <w:szCs w:val="26"/>
-                <w:lang w:val="vi-VN"/>
-              </w:rPr>
-              <w:t xml:space="preserve">Tổng số lượt khám bệnh: </w:t>
-            </w:r>
-            <w:r>
-              <w:rPr>
-                <w:szCs w:val="26"/>
-                <w:lang w:val="vi-VN"/>
-              </w:rPr>
-              <w:t>Khoa Khám bệnh, Cấp cứu, Khoa TSUT, Phòng khám ngoài giờ, Số lượt khám ngoại trú khoa LS, TPNT - khoa Khám bệnh, TPNT - ngoài giờ, CSGN tại nhà, Khám ngoài giờ khoa Xạ 3, Nội 4, khám Tim mạch, khám Dinh dưỡng, Tầm soát bên ngoài, khám răng hàm mặt, khám nội tổng hợp</w:t>
-            </w:r>
-          </w:p>
-        </w:tc>
-      </w:tr>
-      <w:tr>
-        <w:tc>
-          <w:tcPr>
-            <w:tcW w:w="1991" w:type="dxa"/>
-          </w:tcPr>
-          <w:p>
-            <w:pPr>
-              <w:tabs>
-                <w:tab w:val="left" w:pos="567"/>
-              </w:tabs>
-              <w:rPr>
-                <w:b/>
-                <w:lang w:val="vi-VN"/>
-              </w:rPr>
-            </w:pPr>
-            <w:r>
-              <w:rPr>
-                <w:b/>
-                <w:lang w:val="vi-VN"/>
-              </w:rPr>
+              <w:t>khám Dinh dưỡng, Tầm soát bên ngoài, khám răng hàm mặt, khám nội tổng hợp</w:t>
+            </w:r>
+          </w:p>
+        </w:tc>
+      </w:tr>
+      <w:tr>
+        <w:tc>
+          <w:tcPr>
+            <w:tcW w:w="1991" w:type="dxa"/>
+          </w:tcPr>
+          <w:p>
+            <w:pPr>
+              <w:tabs>
+                <w:tab w:val="left" w:pos="567"/>
+              </w:tabs>
+              <w:rPr>
+                <w:b/>
+                <w:lang w:val="vi-VN"/>
+              </w:rPr>
+            </w:pPr>
+            <w:r>
+              <w:rPr>
+                <w:b/>
+                <w:lang w:val="vi-VN"/>
+              </w:rPr>
+              <w:lastRenderedPageBreak/>
               <w:t>Nguồn số liệu</w:t>
             </w:r>
           </w:p>
@@ -17394,17 +16498,7 @@
                 <w:szCs w:val="26"/>
                 <w:lang w:val="vi-VN"/>
               </w:rPr>
-              <w:t xml:space="preserve">Khoa cấp cứu là nơi thường xuyên tiếp nhận nhiều bệnh nhân, trong khi nguồn lực y tế có giới hạn, số lượng người bệnh thay đổi, gia tăng qua từng năm và nhiều trường hợp bệnh nhân vào khoa cùng một thời điểm. </w:t>
-            </w:r>
-            <w:r>
-              <w:rPr>
-                <w:rFonts w:ascii="Times New Roman" w:hAnsi="Times New Roman" w:cs="Times New Roman"/>
-                <w:sz w:val="26"/>
-                <w:szCs w:val="26"/>
-                <w:lang w:val="vi-VN"/>
-              </w:rPr>
-              <w:lastRenderedPageBreak/>
-              <w:t xml:space="preserve">Bên cạnh đó kỹ năng đánh giá , phân loại người bệnh của nhân viên y tế chưa thật sự đồng bộ  </w:t>
+              <w:t xml:space="preserve">Khoa cấp cứu là nơi thường xuyên tiếp nhận nhiều bệnh nhân, trong khi nguồn lực y tế có giới hạn, số lượng người bệnh thay đổi, gia tăng qua từng năm và nhiều trường hợp bệnh nhân vào khoa cùng một thời điểm. Bên cạnh đó kỹ năng đánh giá , phân loại người bệnh của nhân viên y tế chưa thật sự đồng bộ  </w:t>
             </w:r>
           </w:p>
         </w:tc>
@@ -18242,72 +17336,72 @@
                 <w:szCs w:val="26"/>
                 <w:lang w:val="vi-VN"/>
               </w:rPr>
+              <w:t>Khía cạnh chất lượng</w:t>
+            </w:r>
+          </w:p>
+        </w:tc>
+        <w:tc>
+          <w:tcPr>
+            <w:tcW w:w="7711" w:type="dxa"/>
+          </w:tcPr>
+          <w:p>
+            <w:pPr>
+              <w:tabs>
+                <w:tab w:val="left" w:pos="567"/>
+              </w:tabs>
+              <w:spacing w:before="60" w:after="60" w:line="360" w:lineRule="auto"/>
+              <w:jc w:val="both"/>
+              <w:rPr>
+                <w:rFonts w:ascii="Times New Roman" w:hAnsi="Times New Roman" w:cs="Times New Roman"/>
+                <w:color w:val="000000" w:themeColor="text1"/>
+                <w:sz w:val="26"/>
+                <w:szCs w:val="26"/>
+                <w:lang w:val="vi-VN"/>
+              </w:rPr>
+            </w:pPr>
+            <w:r>
+              <w:rPr>
+                <w:rFonts w:ascii="Times New Roman" w:hAnsi="Times New Roman" w:cs="Times New Roman"/>
+                <w:color w:val="000000" w:themeColor="text1"/>
+                <w:sz w:val="26"/>
+                <w:szCs w:val="26"/>
+                <w:lang w:val="vi-VN"/>
+              </w:rPr>
+              <w:t>An toàn</w:t>
+            </w:r>
+          </w:p>
+        </w:tc>
+      </w:tr>
+      <w:tr>
+        <w:tc>
+          <w:tcPr>
+            <w:tcW w:w="1991" w:type="dxa"/>
+          </w:tcPr>
+          <w:p>
+            <w:pPr>
+              <w:tabs>
+                <w:tab w:val="left" w:pos="567"/>
+              </w:tabs>
+              <w:spacing w:before="60" w:after="60" w:line="360" w:lineRule="auto"/>
+              <w:rPr>
+                <w:rFonts w:ascii="Times New Roman" w:hAnsi="Times New Roman" w:cs="Times New Roman"/>
+                <w:b/>
+                <w:color w:val="000000" w:themeColor="text1"/>
+                <w:sz w:val="26"/>
+                <w:szCs w:val="26"/>
+                <w:lang w:val="vi-VN"/>
+              </w:rPr>
+            </w:pPr>
+            <w:r>
+              <w:rPr>
+                <w:rFonts w:ascii="Times New Roman" w:hAnsi="Times New Roman" w:cs="Times New Roman"/>
+                <w:b/>
+                <w:color w:val="000000" w:themeColor="text1"/>
+                <w:sz w:val="26"/>
+                <w:szCs w:val="26"/>
+                <w:lang w:val="vi-VN"/>
+              </w:rPr>
               <w:lastRenderedPageBreak/>
-              <w:t>Khía cạnh chất lượng</w:t>
-            </w:r>
-          </w:p>
-        </w:tc>
-        <w:tc>
-          <w:tcPr>
-            <w:tcW w:w="7711" w:type="dxa"/>
-          </w:tcPr>
-          <w:p>
-            <w:pPr>
-              <w:tabs>
-                <w:tab w:val="left" w:pos="567"/>
-              </w:tabs>
-              <w:spacing w:before="60" w:after="60" w:line="360" w:lineRule="auto"/>
-              <w:jc w:val="both"/>
-              <w:rPr>
-                <w:rFonts w:ascii="Times New Roman" w:hAnsi="Times New Roman" w:cs="Times New Roman"/>
-                <w:color w:val="000000" w:themeColor="text1"/>
-                <w:sz w:val="26"/>
-                <w:szCs w:val="26"/>
-                <w:lang w:val="vi-VN"/>
-              </w:rPr>
-            </w:pPr>
-            <w:r>
-              <w:rPr>
-                <w:rFonts w:ascii="Times New Roman" w:hAnsi="Times New Roman" w:cs="Times New Roman"/>
-                <w:color w:val="000000" w:themeColor="text1"/>
-                <w:sz w:val="26"/>
-                <w:szCs w:val="26"/>
-                <w:lang w:val="vi-VN"/>
-              </w:rPr>
-              <w:t>An toàn</w:t>
-            </w:r>
-          </w:p>
-        </w:tc>
-      </w:tr>
-      <w:tr>
-        <w:tc>
-          <w:tcPr>
-            <w:tcW w:w="1991" w:type="dxa"/>
-          </w:tcPr>
-          <w:p>
-            <w:pPr>
-              <w:tabs>
-                <w:tab w:val="left" w:pos="567"/>
-              </w:tabs>
-              <w:spacing w:before="60" w:after="60" w:line="360" w:lineRule="auto"/>
-              <w:rPr>
-                <w:rFonts w:ascii="Times New Roman" w:hAnsi="Times New Roman" w:cs="Times New Roman"/>
-                <w:b/>
-                <w:color w:val="000000" w:themeColor="text1"/>
-                <w:sz w:val="26"/>
-                <w:szCs w:val="26"/>
-                <w:lang w:val="vi-VN"/>
-              </w:rPr>
-            </w:pPr>
-            <w:r>
-              <w:rPr>
-                <w:rFonts w:ascii="Times New Roman" w:hAnsi="Times New Roman" w:cs="Times New Roman"/>
-                <w:b/>
-                <w:color w:val="000000" w:themeColor="text1"/>
-                <w:sz w:val="26"/>
-                <w:szCs w:val="26"/>
-                <w:lang w:val="vi-VN"/>
-              </w:rPr>
               <w:t>Thành tố chất lượng</w:t>
             </w:r>
           </w:p>
@@ -46618,6 +45712,915 @@
                 <w:lang w:val="vi-VN"/>
               </w:rPr>
               <w:t>Đạt  tỷ lệ &gt;50 %.</w:t>
+            </w:r>
+          </w:p>
+        </w:tc>
+      </w:tr>
+    </w:tbl>
+    <w:p>
+      <w:pPr>
+        <w:spacing w:before="240"/>
+        <w:jc w:val="both"/>
+        <w:rPr>
+          <w:rFonts w:ascii="Times New Roman" w:hAnsi="Times New Roman" w:cs="Times New Roman"/>
+          <w:b/>
+          <w:bCs/>
+          <w:sz w:val="28"/>
+          <w:szCs w:val="28"/>
+        </w:rPr>
+      </w:pPr>
+      <w:r>
+        <w:rPr>
+          <w:rFonts w:ascii="Times New Roman" w:hAnsi="Times New Roman" w:cs="Times New Roman"/>
+          <w:b/>
+          <w:bCs/>
+          <w:sz w:val="28"/>
+          <w:szCs w:val="28"/>
+        </w:rPr>
+        <w:t>14.</w:t>
+      </w:r>
+    </w:p>
+    <w:tbl>
+      <w:tblPr>
+        <w:tblStyle w:val="TableGrid"/>
+        <w:tblW w:w="9702" w:type="dxa"/>
+        <w:tblInd w:w="74" w:type="dxa"/>
+        <w:tblLook w:val="04A0" w:firstRow="1" w:lastRow="0" w:firstColumn="1" w:lastColumn="0" w:noHBand="0" w:noVBand="1"/>
+      </w:tblPr>
+      <w:tblGrid>
+        <w:gridCol w:w="1991"/>
+        <w:gridCol w:w="7711"/>
+      </w:tblGrid>
+      <w:tr>
+        <w:tc>
+          <w:tcPr>
+            <w:tcW w:w="1991" w:type="dxa"/>
+          </w:tcPr>
+          <w:p>
+            <w:pPr>
+              <w:tabs>
+                <w:tab w:val="left" w:pos="567"/>
+              </w:tabs>
+              <w:spacing w:before="60" w:after="60" w:line="276" w:lineRule="auto"/>
+              <w:rPr>
+                <w:rFonts w:ascii="Times New Roman" w:hAnsi="Times New Roman" w:cs="Times New Roman"/>
+                <w:b/>
+                <w:sz w:val="28"/>
+                <w:szCs w:val="28"/>
+                <w:lang w:val="vi-VN"/>
+              </w:rPr>
+            </w:pPr>
+            <w:r>
+              <w:rPr>
+                <w:rFonts w:ascii="Times New Roman" w:hAnsi="Times New Roman" w:cs="Times New Roman"/>
+                <w:b/>
+                <w:sz w:val="28"/>
+                <w:szCs w:val="28"/>
+                <w:lang w:val="vi-VN"/>
+              </w:rPr>
+              <w:t>Tên chỉ số</w:t>
+            </w:r>
+          </w:p>
+        </w:tc>
+        <w:tc>
+          <w:tcPr>
+            <w:tcW w:w="7711" w:type="dxa"/>
+          </w:tcPr>
+          <w:p>
+            <w:pPr>
+              <w:tabs>
+                <w:tab w:val="left" w:pos="567"/>
+              </w:tabs>
+              <w:spacing w:before="60" w:after="60"/>
+              <w:jc w:val="both"/>
+              <w:rPr>
+                <w:rFonts w:ascii="Times New Roman" w:hAnsi="Times New Roman" w:cs="Times New Roman"/>
+                <w:b/>
+                <w:sz w:val="28"/>
+                <w:szCs w:val="28"/>
+                <w:lang w:val="vi-VN"/>
+              </w:rPr>
+            </w:pPr>
+            <w:r>
+              <w:rPr>
+                <w:rFonts w:ascii="Times New Roman" w:hAnsi="Times New Roman" w:cs="Times New Roman"/>
+                <w:color w:val="FF0000"/>
+                <w:sz w:val="28"/>
+                <w:szCs w:val="28"/>
+                <w:lang w:val="vi-VN"/>
+              </w:rPr>
+              <w:t>Số lượng người bệnh được truyền thông dinh dưỡng.</w:t>
+            </w:r>
+          </w:p>
+        </w:tc>
+      </w:tr>
+      <w:tr>
+        <w:tc>
+          <w:tcPr>
+            <w:tcW w:w="1991" w:type="dxa"/>
+          </w:tcPr>
+          <w:p>
+            <w:pPr>
+              <w:tabs>
+                <w:tab w:val="left" w:pos="567"/>
+              </w:tabs>
+              <w:spacing w:before="60" w:after="60" w:line="276" w:lineRule="auto"/>
+              <w:rPr>
+                <w:rFonts w:ascii="Times New Roman" w:hAnsi="Times New Roman" w:cs="Times New Roman"/>
+                <w:b/>
+                <w:sz w:val="28"/>
+                <w:szCs w:val="28"/>
+                <w:lang w:val="vi-VN"/>
+              </w:rPr>
+            </w:pPr>
+            <w:r>
+              <w:rPr>
+                <w:rFonts w:ascii="Times New Roman" w:hAnsi="Times New Roman" w:cs="Times New Roman"/>
+                <w:b/>
+                <w:sz w:val="28"/>
+                <w:szCs w:val="28"/>
+                <w:lang w:val="vi-VN"/>
+              </w:rPr>
+              <w:t>Định nghĩa chỉ số</w:t>
+            </w:r>
+          </w:p>
+        </w:tc>
+        <w:tc>
+          <w:tcPr>
+            <w:tcW w:w="7711" w:type="dxa"/>
+          </w:tcPr>
+          <w:p>
+            <w:pPr>
+              <w:tabs>
+                <w:tab w:val="left" w:pos="567"/>
+              </w:tabs>
+              <w:spacing w:before="60" w:after="60"/>
+              <w:jc w:val="both"/>
+              <w:rPr>
+                <w:rFonts w:ascii="Times New Roman" w:hAnsi="Times New Roman" w:cs="Times New Roman"/>
+                <w:sz w:val="28"/>
+                <w:szCs w:val="28"/>
+                <w:lang w:val="vi-VN"/>
+              </w:rPr>
+            </w:pPr>
+            <w:r>
+              <w:rPr>
+                <w:rFonts w:ascii="Times New Roman" w:hAnsi="Times New Roman" w:cs="Times New Roman"/>
+                <w:sz w:val="28"/>
+                <w:szCs w:val="28"/>
+                <w:lang w:val="vi-VN"/>
+              </w:rPr>
+              <w:t>Là công cụ để đo lường chất lượng về mặt cung cấp kiến thức dinh dưỡng cho người bệnh khi vào viên.</w:t>
+            </w:r>
+          </w:p>
+        </w:tc>
+      </w:tr>
+      <w:tr>
+        <w:tc>
+          <w:tcPr>
+            <w:tcW w:w="1991" w:type="dxa"/>
+          </w:tcPr>
+          <w:p>
+            <w:pPr>
+              <w:tabs>
+                <w:tab w:val="left" w:pos="567"/>
+              </w:tabs>
+              <w:spacing w:before="60" w:after="60" w:line="276" w:lineRule="auto"/>
+              <w:rPr>
+                <w:rFonts w:ascii="Times New Roman" w:hAnsi="Times New Roman" w:cs="Times New Roman"/>
+                <w:b/>
+                <w:sz w:val="28"/>
+                <w:szCs w:val="28"/>
+                <w:lang w:val="vi-VN"/>
+              </w:rPr>
+            </w:pPr>
+            <w:r>
+              <w:rPr>
+                <w:rFonts w:ascii="Times New Roman" w:hAnsi="Times New Roman" w:cs="Times New Roman"/>
+                <w:b/>
+                <w:sz w:val="28"/>
+                <w:szCs w:val="28"/>
+                <w:lang w:val="vi-VN"/>
+              </w:rPr>
+              <w:t>Lĩnh vực áp dụng</w:t>
+            </w:r>
+          </w:p>
+        </w:tc>
+        <w:tc>
+          <w:tcPr>
+            <w:tcW w:w="7711" w:type="dxa"/>
+          </w:tcPr>
+          <w:p>
+            <w:pPr>
+              <w:tabs>
+                <w:tab w:val="left" w:pos="567"/>
+              </w:tabs>
+              <w:spacing w:before="60" w:after="60"/>
+              <w:jc w:val="both"/>
+              <w:rPr>
+                <w:rFonts w:ascii="Times New Roman" w:hAnsi="Times New Roman" w:cs="Times New Roman"/>
+                <w:sz w:val="28"/>
+                <w:szCs w:val="28"/>
+                <w:lang w:val="vi-VN"/>
+              </w:rPr>
+            </w:pPr>
+            <w:r>
+              <w:rPr>
+                <w:rFonts w:ascii="Times New Roman" w:hAnsi="Times New Roman" w:cs="Times New Roman"/>
+                <w:sz w:val="28"/>
+                <w:szCs w:val="28"/>
+                <w:lang w:val="vi-VN"/>
+              </w:rPr>
+              <w:t>Cung cấp kiến thức và truyền thông dinh dưỡng.</w:t>
+            </w:r>
+          </w:p>
+        </w:tc>
+      </w:tr>
+      <w:tr>
+        <w:tc>
+          <w:tcPr>
+            <w:tcW w:w="1991" w:type="dxa"/>
+          </w:tcPr>
+          <w:p>
+            <w:pPr>
+              <w:tabs>
+                <w:tab w:val="left" w:pos="567"/>
+              </w:tabs>
+              <w:spacing w:before="60" w:after="60" w:line="276" w:lineRule="auto"/>
+              <w:rPr>
+                <w:rFonts w:ascii="Times New Roman" w:hAnsi="Times New Roman" w:cs="Times New Roman"/>
+                <w:b/>
+                <w:sz w:val="28"/>
+                <w:szCs w:val="28"/>
+                <w:lang w:val="vi-VN"/>
+              </w:rPr>
+            </w:pPr>
+            <w:r>
+              <w:rPr>
+                <w:rFonts w:ascii="Times New Roman" w:hAnsi="Times New Roman" w:cs="Times New Roman"/>
+                <w:b/>
+                <w:sz w:val="28"/>
+                <w:szCs w:val="28"/>
+                <w:lang w:val="vi-VN"/>
+              </w:rPr>
+              <w:t>Khía cạnh chất lượng</w:t>
+            </w:r>
+          </w:p>
+        </w:tc>
+        <w:tc>
+          <w:tcPr>
+            <w:tcW w:w="7711" w:type="dxa"/>
+          </w:tcPr>
+          <w:p>
+            <w:pPr>
+              <w:tabs>
+                <w:tab w:val="left" w:pos="567"/>
+              </w:tabs>
+              <w:spacing w:before="60" w:after="60"/>
+              <w:jc w:val="both"/>
+              <w:rPr>
+                <w:rFonts w:ascii="Times New Roman" w:hAnsi="Times New Roman" w:cs="Times New Roman"/>
+                <w:sz w:val="28"/>
+                <w:szCs w:val="28"/>
+                <w:lang w:val="vi-VN"/>
+              </w:rPr>
+            </w:pPr>
+            <w:r>
+              <w:rPr>
+                <w:rFonts w:ascii="Times New Roman" w:hAnsi="Times New Roman" w:cs="Times New Roman"/>
+                <w:sz w:val="28"/>
+                <w:szCs w:val="28"/>
+                <w:lang w:val="vi-VN"/>
+              </w:rPr>
+              <w:t>Thay đổi hành vi dinh dưỡng của người bệnh.</w:t>
+            </w:r>
+          </w:p>
+        </w:tc>
+      </w:tr>
+      <w:tr>
+        <w:tc>
+          <w:tcPr>
+            <w:tcW w:w="1991" w:type="dxa"/>
+          </w:tcPr>
+          <w:p>
+            <w:pPr>
+              <w:tabs>
+                <w:tab w:val="left" w:pos="567"/>
+              </w:tabs>
+              <w:spacing w:before="60" w:after="60" w:line="276" w:lineRule="auto"/>
+              <w:rPr>
+                <w:rFonts w:ascii="Times New Roman" w:hAnsi="Times New Roman" w:cs="Times New Roman"/>
+                <w:b/>
+                <w:sz w:val="28"/>
+                <w:szCs w:val="28"/>
+                <w:lang w:val="vi-VN"/>
+              </w:rPr>
+            </w:pPr>
+            <w:r>
+              <w:rPr>
+                <w:rFonts w:ascii="Times New Roman" w:hAnsi="Times New Roman" w:cs="Times New Roman"/>
+                <w:b/>
+                <w:sz w:val="28"/>
+                <w:szCs w:val="28"/>
+                <w:lang w:val="vi-VN"/>
+              </w:rPr>
+              <w:t>Thành tố chất lượng</w:t>
+            </w:r>
+          </w:p>
+        </w:tc>
+        <w:tc>
+          <w:tcPr>
+            <w:tcW w:w="7711" w:type="dxa"/>
+          </w:tcPr>
+          <w:p>
+            <w:pPr>
+              <w:pStyle w:val="ListParagraph"/>
+              <w:ind w:left="360"/>
+              <w:jc w:val="both"/>
+              <w:rPr>
+                <w:rFonts w:ascii="Times New Roman" w:hAnsi="Times New Roman" w:cs="Times New Roman"/>
+                <w:i/>
+                <w:color w:val="FF0000"/>
+                <w:sz w:val="28"/>
+                <w:szCs w:val="28"/>
+                <w:u w:val="single"/>
+                <w:lang w:val="vi-VN"/>
+              </w:rPr>
+            </w:pPr>
+            <w:r>
+              <w:rPr>
+                <w:rFonts w:ascii="Times New Roman" w:hAnsi="Times New Roman" w:cs="Times New Roman"/>
+                <w:sz w:val="28"/>
+                <w:szCs w:val="28"/>
+                <w:u w:val="single"/>
+                <w:lang w:val="vi-VN"/>
+              </w:rPr>
+              <w:t>Đầu ra</w:t>
+            </w:r>
+            <w:r>
+              <w:rPr>
+                <w:rFonts w:ascii="Times New Roman" w:hAnsi="Times New Roman" w:cs="Times New Roman"/>
+                <w:i/>
+                <w:color w:val="FF0000"/>
+                <w:sz w:val="28"/>
+                <w:szCs w:val="28"/>
+                <w:u w:val="single"/>
+                <w:lang w:val="vi-VN"/>
+              </w:rPr>
+              <w:t xml:space="preserve"> </w:t>
+            </w:r>
+          </w:p>
+        </w:tc>
+      </w:tr>
+      <w:tr>
+        <w:tc>
+          <w:tcPr>
+            <w:tcW w:w="1991" w:type="dxa"/>
+          </w:tcPr>
+          <w:p>
+            <w:pPr>
+              <w:tabs>
+                <w:tab w:val="left" w:pos="567"/>
+              </w:tabs>
+              <w:spacing w:before="60" w:after="60" w:line="276" w:lineRule="auto"/>
+              <w:rPr>
+                <w:rFonts w:ascii="Times New Roman" w:hAnsi="Times New Roman" w:cs="Times New Roman"/>
+                <w:b/>
+                <w:sz w:val="28"/>
+                <w:szCs w:val="28"/>
+                <w:lang w:val="vi-VN"/>
+              </w:rPr>
+            </w:pPr>
+            <w:r>
+              <w:rPr>
+                <w:rFonts w:ascii="Times New Roman" w:hAnsi="Times New Roman" w:cs="Times New Roman"/>
+                <w:b/>
+                <w:sz w:val="28"/>
+                <w:szCs w:val="28"/>
+                <w:lang w:val="vi-VN"/>
+              </w:rPr>
+              <w:t>Lý do lựa chọn</w:t>
+            </w:r>
+          </w:p>
+        </w:tc>
+        <w:tc>
+          <w:tcPr>
+            <w:tcW w:w="7711" w:type="dxa"/>
+          </w:tcPr>
+          <w:p>
+            <w:pPr>
+              <w:tabs>
+                <w:tab w:val="left" w:pos="567"/>
+              </w:tabs>
+              <w:spacing w:before="60" w:after="60"/>
+              <w:rPr>
+                <w:rFonts w:ascii="Times New Roman" w:hAnsi="Times New Roman" w:cs="Times New Roman"/>
+                <w:sz w:val="28"/>
+                <w:szCs w:val="28"/>
+                <w:lang w:val="vi-VN"/>
+              </w:rPr>
+            </w:pPr>
+            <w:r>
+              <w:rPr>
+                <w:rFonts w:ascii="Times New Roman" w:hAnsi="Times New Roman" w:cs="Times New Roman"/>
+                <w:sz w:val="28"/>
+                <w:szCs w:val="28"/>
+                <w:lang w:val="vi-VN"/>
+              </w:rPr>
+              <w:t>Lý do lựa chọn: mong muốn cải thiên tình trạng dinh dưỡng cho người bệnh ung thư, cải thiện chất lượng cuộc sống cho người bệnh.</w:t>
+            </w:r>
+          </w:p>
+        </w:tc>
+      </w:tr>
+      <w:tr>
+        <w:tc>
+          <w:tcPr>
+            <w:tcW w:w="1991" w:type="dxa"/>
+          </w:tcPr>
+          <w:p>
+            <w:pPr>
+              <w:tabs>
+                <w:tab w:val="left" w:pos="567"/>
+              </w:tabs>
+              <w:spacing w:before="60" w:after="60" w:line="276" w:lineRule="auto"/>
+              <w:rPr>
+                <w:rFonts w:ascii="Times New Roman" w:hAnsi="Times New Roman" w:cs="Times New Roman"/>
+                <w:b/>
+                <w:sz w:val="28"/>
+                <w:szCs w:val="28"/>
+                <w:lang w:val="vi-VN"/>
+              </w:rPr>
+            </w:pPr>
+            <w:r>
+              <w:rPr>
+                <w:rFonts w:ascii="Times New Roman" w:hAnsi="Times New Roman" w:cs="Times New Roman"/>
+                <w:b/>
+                <w:sz w:val="28"/>
+                <w:szCs w:val="28"/>
+                <w:lang w:val="vi-VN"/>
+              </w:rPr>
+              <w:t>Phương pháp tính</w:t>
+            </w:r>
+          </w:p>
+        </w:tc>
+        <w:tc>
+          <w:tcPr>
+            <w:tcW w:w="7711" w:type="dxa"/>
+          </w:tcPr>
+          <w:p>
+            <w:pPr>
+              <w:pStyle w:val="ListParagraph"/>
+              <w:tabs>
+                <w:tab w:val="left" w:pos="567"/>
+              </w:tabs>
+              <w:spacing w:before="60" w:after="60"/>
+              <w:ind w:left="360"/>
+              <w:jc w:val="both"/>
+              <w:rPr>
+                <w:rFonts w:ascii="Times New Roman" w:hAnsi="Times New Roman" w:cs="Times New Roman"/>
+                <w:sz w:val="28"/>
+                <w:szCs w:val="28"/>
+                <w:lang w:val="vi-VN"/>
+              </w:rPr>
+            </w:pPr>
+            <w:r>
+              <w:rPr>
+                <w:rFonts w:ascii="Times New Roman" w:hAnsi="Times New Roman" w:cs="Times New Roman"/>
+                <w:sz w:val="28"/>
+                <w:szCs w:val="28"/>
+                <w:lang w:val="vi-VN"/>
+              </w:rPr>
+              <w:t xml:space="preserve"> </w:t>
+            </w:r>
+          </w:p>
+        </w:tc>
+      </w:tr>
+      <w:tr>
+        <w:tc>
+          <w:tcPr>
+            <w:tcW w:w="1991" w:type="dxa"/>
+          </w:tcPr>
+          <w:p>
+            <w:pPr>
+              <w:tabs>
+                <w:tab w:val="left" w:pos="567"/>
+              </w:tabs>
+              <w:spacing w:before="60" w:after="60" w:line="276" w:lineRule="auto"/>
+              <w:jc w:val="right"/>
+              <w:rPr>
+                <w:rFonts w:ascii="Times New Roman" w:hAnsi="Times New Roman" w:cs="Times New Roman"/>
+                <w:i/>
+                <w:sz w:val="28"/>
+                <w:szCs w:val="28"/>
+                <w:lang w:val="vi-VN"/>
+              </w:rPr>
+            </w:pPr>
+            <w:r>
+              <w:rPr>
+                <w:rFonts w:ascii="Times New Roman" w:hAnsi="Times New Roman" w:cs="Times New Roman"/>
+                <w:i/>
+                <w:sz w:val="28"/>
+                <w:szCs w:val="28"/>
+                <w:lang w:val="vi-VN"/>
+              </w:rPr>
+              <w:lastRenderedPageBreak/>
+              <w:t>Tử số</w:t>
+            </w:r>
+          </w:p>
+        </w:tc>
+        <w:tc>
+          <w:tcPr>
+            <w:tcW w:w="7711" w:type="dxa"/>
+          </w:tcPr>
+          <w:p>
+            <w:pPr>
+              <w:tabs>
+                <w:tab w:val="left" w:pos="567"/>
+              </w:tabs>
+              <w:spacing w:before="60" w:after="60"/>
+              <w:jc w:val="both"/>
+              <w:rPr>
+                <w:rFonts w:ascii="Times New Roman" w:hAnsi="Times New Roman" w:cs="Times New Roman"/>
+                <w:sz w:val="28"/>
+                <w:szCs w:val="28"/>
+                <w:lang w:val="vi-VN"/>
+              </w:rPr>
+            </w:pPr>
+            <w:r>
+              <w:rPr>
+                <w:rFonts w:ascii="Times New Roman" w:hAnsi="Times New Roman" w:cs="Times New Roman"/>
+                <w:sz w:val="28"/>
+                <w:szCs w:val="28"/>
+                <w:lang w:val="vi-VN"/>
+              </w:rPr>
+              <w:t>Số lần truyền thông X (Số lượng người bệnh+ người nhà được truyền thông dinh dưỡng/ 1 lần truyền thông).</w:t>
+            </w:r>
+          </w:p>
+        </w:tc>
+      </w:tr>
+      <w:tr>
+        <w:tc>
+          <w:tcPr>
+            <w:tcW w:w="1991" w:type="dxa"/>
+          </w:tcPr>
+          <w:p>
+            <w:pPr>
+              <w:tabs>
+                <w:tab w:val="left" w:pos="567"/>
+              </w:tabs>
+              <w:spacing w:before="60" w:after="60" w:line="276" w:lineRule="auto"/>
+              <w:jc w:val="right"/>
+              <w:rPr>
+                <w:rFonts w:ascii="Times New Roman" w:hAnsi="Times New Roman" w:cs="Times New Roman"/>
+                <w:i/>
+                <w:sz w:val="28"/>
+                <w:szCs w:val="28"/>
+                <w:lang w:val="vi-VN"/>
+              </w:rPr>
+            </w:pPr>
+            <w:r>
+              <w:rPr>
+                <w:rFonts w:ascii="Times New Roman" w:hAnsi="Times New Roman" w:cs="Times New Roman"/>
+                <w:i/>
+                <w:sz w:val="28"/>
+                <w:szCs w:val="28"/>
+                <w:lang w:val="vi-VN"/>
+              </w:rPr>
+              <w:t>Mẫu số</w:t>
+            </w:r>
+          </w:p>
+        </w:tc>
+        <w:tc>
+          <w:tcPr>
+            <w:tcW w:w="7711" w:type="dxa"/>
+          </w:tcPr>
+          <w:p>
+            <w:pPr>
+              <w:tabs>
+                <w:tab w:val="left" w:pos="567"/>
+              </w:tabs>
+              <w:spacing w:before="60" w:after="60"/>
+              <w:jc w:val="both"/>
+              <w:rPr>
+                <w:rFonts w:ascii="Times New Roman" w:hAnsi="Times New Roman" w:cs="Times New Roman"/>
+                <w:sz w:val="28"/>
+                <w:szCs w:val="28"/>
+                <w:lang w:val="vi-VN"/>
+              </w:rPr>
+            </w:pPr>
+            <w:r>
+              <w:rPr>
+                <w:rFonts w:ascii="Times New Roman" w:hAnsi="Times New Roman" w:cs="Times New Roman"/>
+                <w:sz w:val="28"/>
+                <w:szCs w:val="28"/>
+                <w:lang w:val="vi-VN"/>
+              </w:rPr>
+              <w:t>Số lượng bệnh nhân nhập viện (không tính phòng khám) X 2 lần.</w:t>
+            </w:r>
+          </w:p>
+        </w:tc>
+      </w:tr>
+      <w:tr>
+        <w:tc>
+          <w:tcPr>
+            <w:tcW w:w="1991" w:type="dxa"/>
+          </w:tcPr>
+          <w:p>
+            <w:pPr>
+              <w:tabs>
+                <w:tab w:val="left" w:pos="567"/>
+              </w:tabs>
+              <w:spacing w:before="60" w:after="60" w:line="276" w:lineRule="auto"/>
+              <w:rPr>
+                <w:rFonts w:ascii="Times New Roman" w:hAnsi="Times New Roman" w:cs="Times New Roman"/>
+                <w:b/>
+                <w:sz w:val="28"/>
+                <w:szCs w:val="28"/>
+                <w:lang w:val="vi-VN"/>
+              </w:rPr>
+            </w:pPr>
+            <w:r>
+              <w:rPr>
+                <w:rFonts w:ascii="Times New Roman" w:hAnsi="Times New Roman" w:cs="Times New Roman"/>
+                <w:b/>
+                <w:sz w:val="28"/>
+                <w:szCs w:val="28"/>
+                <w:lang w:val="vi-VN"/>
+              </w:rPr>
+              <w:t>Nguồn số liệu</w:t>
+            </w:r>
+          </w:p>
+        </w:tc>
+        <w:tc>
+          <w:tcPr>
+            <w:tcW w:w="7711" w:type="dxa"/>
+          </w:tcPr>
+          <w:p>
+            <w:pPr>
+              <w:tabs>
+                <w:tab w:val="left" w:pos="567"/>
+              </w:tabs>
+              <w:spacing w:before="60" w:after="60"/>
+              <w:jc w:val="both"/>
+              <w:rPr>
+                <w:rFonts w:ascii="Times New Roman" w:hAnsi="Times New Roman" w:cs="Times New Roman"/>
+                <w:sz w:val="28"/>
+                <w:szCs w:val="28"/>
+                <w:lang w:val="vi-VN"/>
+              </w:rPr>
+            </w:pPr>
+            <w:r>
+              <w:rPr>
+                <w:rFonts w:ascii="Times New Roman" w:hAnsi="Times New Roman" w:cs="Times New Roman"/>
+                <w:sz w:val="28"/>
+                <w:szCs w:val="28"/>
+                <w:lang w:val="vi-VN"/>
+              </w:rPr>
+              <w:t>Người bệnh hoặc người nhà bệnh nhân.</w:t>
+            </w:r>
+          </w:p>
+        </w:tc>
+      </w:tr>
+      <w:tr>
+        <w:tc>
+          <w:tcPr>
+            <w:tcW w:w="1991" w:type="dxa"/>
+          </w:tcPr>
+          <w:p>
+            <w:pPr>
+              <w:tabs>
+                <w:tab w:val="left" w:pos="567"/>
+              </w:tabs>
+              <w:spacing w:before="60" w:after="60" w:line="276" w:lineRule="auto"/>
+              <w:rPr>
+                <w:rFonts w:ascii="Times New Roman" w:hAnsi="Times New Roman" w:cs="Times New Roman"/>
+                <w:b/>
+                <w:sz w:val="28"/>
+                <w:szCs w:val="28"/>
+                <w:lang w:val="vi-VN"/>
+              </w:rPr>
+            </w:pPr>
+            <w:r>
+              <w:rPr>
+                <w:rFonts w:ascii="Times New Roman" w:hAnsi="Times New Roman" w:cs="Times New Roman"/>
+                <w:b/>
+                <w:sz w:val="28"/>
+                <w:szCs w:val="28"/>
+                <w:lang w:val="vi-VN"/>
+              </w:rPr>
+              <w:t>Thu thập và tổng hợp số liệu</w:t>
+            </w:r>
+          </w:p>
+        </w:tc>
+        <w:tc>
+          <w:tcPr>
+            <w:tcW w:w="7711" w:type="dxa"/>
+          </w:tcPr>
+          <w:p>
+            <w:pPr>
+              <w:tabs>
+                <w:tab w:val="left" w:pos="567"/>
+              </w:tabs>
+              <w:spacing w:before="60" w:after="60"/>
+              <w:jc w:val="both"/>
+              <w:rPr>
+                <w:rFonts w:ascii="Times New Roman" w:hAnsi="Times New Roman" w:cs="Times New Roman"/>
+                <w:sz w:val="28"/>
+                <w:szCs w:val="28"/>
+                <w:lang w:val="vi-VN"/>
+              </w:rPr>
+            </w:pPr>
+            <w:r>
+              <w:rPr>
+                <w:rFonts w:ascii="Times New Roman" w:hAnsi="Times New Roman" w:cs="Times New Roman"/>
+                <w:sz w:val="28"/>
+                <w:szCs w:val="28"/>
+                <w:lang w:val="vi-VN"/>
+              </w:rPr>
+              <w:t>Hiện nay, bệnh viện đang thu thập và tổng hợp số liệu số lượng người bệnh được truyền thông dinh dưỡng khi vào viện.</w:t>
+            </w:r>
+          </w:p>
+        </w:tc>
+      </w:tr>
+      <w:tr>
+        <w:tc>
+          <w:tcPr>
+            <w:tcW w:w="1991" w:type="dxa"/>
+          </w:tcPr>
+          <w:p>
+            <w:pPr>
+              <w:tabs>
+                <w:tab w:val="left" w:pos="567"/>
+              </w:tabs>
+              <w:spacing w:before="60" w:after="60" w:line="276" w:lineRule="auto"/>
+              <w:rPr>
+                <w:rFonts w:ascii="Times New Roman" w:hAnsi="Times New Roman" w:cs="Times New Roman"/>
+                <w:b/>
+                <w:sz w:val="28"/>
+                <w:szCs w:val="28"/>
+                <w:lang w:val="vi-VN"/>
+              </w:rPr>
+            </w:pPr>
+            <w:r>
+              <w:rPr>
+                <w:rFonts w:ascii="Times New Roman" w:hAnsi="Times New Roman" w:cs="Times New Roman"/>
+                <w:b/>
+                <w:sz w:val="28"/>
+                <w:szCs w:val="28"/>
+                <w:lang w:val="vi-VN"/>
+              </w:rPr>
+              <w:t>Giá trị của số liệu</w:t>
+            </w:r>
+          </w:p>
+        </w:tc>
+        <w:tc>
+          <w:tcPr>
+            <w:tcW w:w="7711" w:type="dxa"/>
+          </w:tcPr>
+          <w:p>
+            <w:pPr>
+              <w:tabs>
+                <w:tab w:val="left" w:pos="567"/>
+              </w:tabs>
+              <w:spacing w:before="60" w:after="60"/>
+              <w:jc w:val="both"/>
+              <w:rPr>
+                <w:rFonts w:ascii="Times New Roman" w:hAnsi="Times New Roman" w:cs="Times New Roman"/>
+                <w:sz w:val="28"/>
+                <w:szCs w:val="28"/>
+                <w:lang w:val="vi-VN"/>
+              </w:rPr>
+            </w:pPr>
+            <w:r>
+              <w:rPr>
+                <w:rFonts w:ascii="Times New Roman" w:hAnsi="Times New Roman" w:cs="Times New Roman"/>
+                <w:sz w:val="28"/>
+                <w:szCs w:val="28"/>
+                <w:lang w:val="vi-VN"/>
+              </w:rPr>
+              <w:t>Độ chính xác cao vì lấy số liệu thực tế.</w:t>
+            </w:r>
+          </w:p>
+        </w:tc>
+      </w:tr>
+      <w:tr>
+        <w:tc>
+          <w:tcPr>
+            <w:tcW w:w="1991" w:type="dxa"/>
+          </w:tcPr>
+          <w:p>
+            <w:pPr>
+              <w:tabs>
+                <w:tab w:val="left" w:pos="567"/>
+              </w:tabs>
+              <w:spacing w:before="60" w:after="60" w:line="276" w:lineRule="auto"/>
+              <w:rPr>
+                <w:rFonts w:ascii="Times New Roman" w:hAnsi="Times New Roman" w:cs="Times New Roman"/>
+                <w:b/>
+                <w:sz w:val="28"/>
+                <w:szCs w:val="28"/>
+                <w:lang w:val="vi-VN"/>
+              </w:rPr>
+            </w:pPr>
+            <w:r>
+              <w:rPr>
+                <w:rFonts w:ascii="Times New Roman" w:hAnsi="Times New Roman" w:cs="Times New Roman"/>
+                <w:b/>
+                <w:sz w:val="28"/>
+                <w:szCs w:val="28"/>
+                <w:lang w:val="vi-VN"/>
+              </w:rPr>
+              <w:t>Tần suất báo cáo</w:t>
+            </w:r>
+          </w:p>
+        </w:tc>
+        <w:tc>
+          <w:tcPr>
+            <w:tcW w:w="7711" w:type="dxa"/>
+          </w:tcPr>
+          <w:p>
+            <w:pPr>
+              <w:tabs>
+                <w:tab w:val="left" w:pos="567"/>
+              </w:tabs>
+              <w:spacing w:before="60" w:after="60"/>
+              <w:jc w:val="both"/>
+              <w:rPr>
+                <w:rFonts w:ascii="Times New Roman" w:hAnsi="Times New Roman" w:cs="Times New Roman"/>
+                <w:sz w:val="28"/>
+                <w:szCs w:val="28"/>
+                <w:lang w:val="vi-VN"/>
+              </w:rPr>
+            </w:pPr>
+            <w:r>
+              <w:rPr>
+                <w:rFonts w:ascii="Times New Roman" w:hAnsi="Times New Roman" w:cs="Times New Roman"/>
+                <w:sz w:val="28"/>
+                <w:szCs w:val="28"/>
+                <w:lang w:val="vi-VN"/>
+              </w:rPr>
+              <w:t>6 lần truyền thông (tại bệnh nhân, tại khoa).</w:t>
+            </w:r>
+          </w:p>
+        </w:tc>
+      </w:tr>
+      <w:tr>
+        <w:tc>
+          <w:tcPr>
+            <w:tcW w:w="1991" w:type="dxa"/>
+          </w:tcPr>
+          <w:p>
+            <w:pPr>
+              <w:tabs>
+                <w:tab w:val="left" w:pos="567"/>
+              </w:tabs>
+              <w:spacing w:before="60" w:after="60" w:line="276" w:lineRule="auto"/>
+              <w:rPr>
+                <w:rFonts w:ascii="Times New Roman" w:hAnsi="Times New Roman" w:cs="Times New Roman"/>
+                <w:b/>
+                <w:sz w:val="28"/>
+                <w:szCs w:val="28"/>
+                <w:lang w:val="vi-VN"/>
+              </w:rPr>
+            </w:pPr>
+            <w:r>
+              <w:rPr>
+                <w:rFonts w:ascii="Times New Roman" w:hAnsi="Times New Roman" w:cs="Times New Roman"/>
+                <w:b/>
+                <w:sz w:val="28"/>
+                <w:szCs w:val="28"/>
+                <w:lang w:val="vi-VN"/>
+              </w:rPr>
+              <w:t>Mục tiêu đạt được trong năm 2020</w:t>
+            </w:r>
+          </w:p>
+        </w:tc>
+        <w:tc>
+          <w:tcPr>
+            <w:tcW w:w="7711" w:type="dxa"/>
+          </w:tcPr>
+          <w:p>
+            <w:pPr>
+              <w:tabs>
+                <w:tab w:val="left" w:pos="567"/>
+              </w:tabs>
+              <w:spacing w:before="60" w:after="60"/>
+              <w:jc w:val="both"/>
+              <w:rPr>
+                <w:rFonts w:ascii="Times New Roman" w:hAnsi="Times New Roman" w:cs="Times New Roman"/>
+                <w:sz w:val="28"/>
+                <w:szCs w:val="28"/>
+                <w:lang w:val="vi-VN"/>
+              </w:rPr>
+            </w:pPr>
+            <w:r>
+              <w:rPr>
+                <w:rFonts w:ascii="Times New Roman" w:hAnsi="Times New Roman" w:cs="Times New Roman"/>
+                <w:sz w:val="28"/>
+                <w:szCs w:val="28"/>
+                <w:lang w:val="vi-VN"/>
+              </w:rPr>
+              <w:t>Đạt &gt; 50 % , 6 lần tổ chức/năm.</w:t>
             </w:r>
           </w:p>
         </w:tc>

</xml_diff>